<commit_message>
Retune voice gate for 24-bit mics; live table-match plot (GCC-PHAT, x4 table)
- g_clap_abs 3e-6 -> 1e-4: retuned for the uniform 24-bit front-end (live "alo"
  peaks maxLev_u ~2k-28k, silence ~250). Catches speech; residual gate rejects
  incoherent noise. All 4 pairs coherent (0.86-0.99) on voice.
- plot_doa.py: 2-panel window (DOA arrow + live compare-TDOA-to-table panel),
  TDOA via band-limited GCC-PHAT + phase-slope (matches firmware), all 4 pairs,
  no 180 flip. Table shown in QUARTER-SAMPLE (x4 delay) units mirroring the
  firmware g_doa_table_x4; measured lags rounded to the 1/4-sample grid.
- doa_match_live.py / plot_doa.py: cross-spectrum conj(Xa)*Xb to match the
  firmware GCC_PHAT delay-sign convention.
- docs: refresh thesis doc.

Co-Authored-By: Claude Opus 4.8 <noreply@anthropic.com>
</commit_message>
<xml_diff>
--- a/docs/DATH_VuDongTrieu_42101042.docx
+++ b/docs/DATH_VuDongTrieu_42101042.docx
@@ -412,7 +412,12 @@
           <w:i/>
         </w:rPr>
         <w:sectPr>
-          <w:footerReference w:type="default" r:id="rId10"/>
+          <w:headerReference w:type="even" r:id="rId10"/>
+          <w:headerReference w:type="default" r:id="rId11"/>
+          <w:footerReference w:type="even" r:id="rId12"/>
+          <w:footerReference w:type="default" r:id="rId13"/>
+          <w:headerReference w:type="first" r:id="rId14"/>
+          <w:footerReference w:type="first" r:id="rId15"/>
           <w:pgSz w:w="11909" w:h="16834"/>
           <w:pgMar w:top="1701" w:right="1134" w:bottom="1701" w:left="1985" w:header="576" w:footer="288" w:gutter="0"/>
           <w:pgNumType w:start="1"/>
@@ -853,9 +858,9 @@
           <w:szCs w:val="28"/>
         </w:rPr>
         <w:sectPr>
-          <w:headerReference w:type="default" r:id="rId11"/>
-          <w:footerReference w:type="default" r:id="rId12"/>
-          <w:footerReference w:type="first" r:id="rId13"/>
+          <w:headerReference w:type="default" r:id="rId16"/>
+          <w:footerReference w:type="default" r:id="rId17"/>
+          <w:footerReference w:type="first" r:id="rId18"/>
           <w:pgSz w:w="11909" w:h="16834"/>
           <w:pgMar w:top="1985" w:right="1134" w:bottom="1701" w:left="1985" w:header="576" w:footer="288" w:gutter="0"/>
           <w:pgNumType w:start="1"/>
@@ -1372,10 +1377,7 @@
         <w:pStyle w:val="Heading3"/>
       </w:pPr>
       <w:r>
-        <w:t>N</w:t>
-      </w:r>
-      <w:r>
-        <w:t>guyên lý cơ bản của phương pháp TDOA</w:t>
+        <w:t>Nguyên lý cơ bản TDOA</w:t>
       </w:r>
     </w:p>
     <w:p>
@@ -1468,7 +1470,13 @@
       </w:pPr>
       <w:r>
         <w:lastRenderedPageBreak/>
-        <w:t>Công thức (2.2) là phương trình cốt lõi để hệ thống camera định hướng bằng âm thanh xác định hướng quay của camera về phía nguồn âm. Giá trị t được ước lượng thông qua kỹ thuật tương quan chéo (sẽ trình bày ở mục 2.1.3), sau đó α được tính toán và chuyển đổi thành tín hiệu điều khiển servo.</w:t>
+        <w:t>Công thức (2.2) là phương trình cốt lõi để hệ thống camera định hướng bằng âm thanh xác định hướng quay của camera về phía nguồn âm. Giá trị t được ước lượng thông qua kỹ thuật tương quan chéo (sẽ trình bày ở mục 2.1.</w:t>
+      </w:r>
+      <w:r>
+        <w:t>5</w:t>
+      </w:r>
+      <w:r>
+        <w:t>), sau đó α được tính toán và chuyển đổi thành tín hiệu điều khiển servo.</w:t>
       </w:r>
     </w:p>
     <w:p>
@@ -1476,7 +1484,10 @@
         <w:pStyle w:val="Heading3"/>
       </w:pPr>
       <w:r>
-        <w:t>Mô hình hình học mảng microphone</w:t>
+        <w:t xml:space="preserve">Mô hình hình học mảng microphone </w:t>
+      </w:r>
+      <w:r>
+        <w:t>.</w:t>
       </w:r>
     </w:p>
     <w:p>
@@ -1538,7 +1549,19 @@
         </w:numPr>
       </w:pPr>
       <w:r>
-        <w:t xml:space="preserve">d = 0,25 m và c = 343 m/s, tần số giới hạn trên là f_max = 343 / (2 × 0,25) = 686 Hz. </w:t>
+        <w:t>d = 0,25</w:t>
+      </w:r>
+    </w:p>
+    <w:p>
+      <w:pPr>
+        <w:pStyle w:val="ListParagraph"/>
+        <w:numPr>
+          <w:ilvl w:val="0"/>
+          <w:numId w:val="55"/>
+        </w:numPr>
+      </w:pPr>
+      <w:r>
+        <w:t xml:space="preserve"> m và c = 343 m/s, tần số giới hạn trên là f_max = 343 / (2 × 0,25) = 686 Hz. </w:t>
       </w:r>
     </w:p>
     <w:p>
@@ -1566,7 +1589,7 @@
         <w:pStyle w:val="Heading3"/>
       </w:pPr>
       <w:r>
-        <w:t>Biến đổi Fourier nhanh FFT 1024 điểm</w:t>
+        <w:t>Độ trễ cực đại theo số mẫu</w:t>
       </w:r>
     </w:p>
     <w:p>
@@ -1574,7 +1597,7 @@
         <w:ind w:firstLine="720"/>
       </w:pPr>
       <w:r>
-        <w:t>Trong các hệ thống xử lý tín hiệu số hiện đại, việc chuyển đổi tín hiệu từ miền thời gian sang miền tần số đóng vai trò rất quan trọng trong quá trình phân tích và xử lý tín hiệu. Một trong những công cụ được sử dụng phổ biến nhất là biến đổi Fourier nhanh (Fast Fourier Transform – FFT). FFT là thuật toán tối ưu của biến đổi Fourier rời rạc (Discrete Fourier Transform – DFT), cho phép giảm đáng kể số phép tính cần thực hiện và tăng tốc độ xử lý của hệ thống.</w:t>
+        <w:t>Sau khi trình bày cơ sở lý thuyết của phương pháp TDOA, phần này tiến hành áp dụng các công thức đã xây dựng cho mảng microphone được sử dụng trong đề tài. Việc xác định độ trễ cực đại giữa các microphone là cơ sở để giới hạn phạm vi tìm kiếm của thuật toán GCC-PHAT, đồng thời phục vụ quá trình xây dựng bảng mẫu độ trễ (Delay Map).</w:t>
       </w:r>
     </w:p>
     <w:p>
@@ -1582,14 +1605,42 @@
         <w:ind w:firstLine="720"/>
       </w:pPr>
       <w:r>
-        <w:t>Đối với tín hiệu rời rạc x(n) gồm N mẫu, biến đổi Fourier rời rạc được biểu diễn theo công thức:</w:t>
-      </w:r>
-    </w:p>
-    <w:p>
-      <w:pPr>
-        <w:spacing w:before="120" w:after="120"/>
+        <w:t>Trong đề tài, mảng microphone gồm bốn microphone INMP441 được bố trí với khoảng cách giữa hai microphone liền kề là:</w:t>
+      </w:r>
+    </w:p>
+    <w:p>
+      <w:pPr>
         <w:ind w:firstLine="720"/>
+        <w:rPr>
+          <w:rFonts w:ascii="Courier New" w:hAnsi="Courier New" w:cs="Courier New"/>
+        </w:rPr>
+      </w:pPr>
+      <m:oMathPara>
+        <m:oMath>
+          <m:r>
+            <w:rPr>
+              <w:rFonts w:ascii="Cambria Math" w:hAnsi="Cambria Math" w:cs="Courier New"/>
+            </w:rPr>
+            <m:t>d = 80 mm = 0.08 m</m:t>
+          </m:r>
+        </m:oMath>
+      </m:oMathPara>
+    </w:p>
+    <w:p>
+      <w:pPr>
+        <w:ind w:firstLine="720"/>
+      </w:pPr>
+      <w:r>
+        <w:t>Theo lý thuyết TDOA đã trình bày ở mục 2.1, độ lệch thời gian đến giữa hai microphone được xác định bởi:</w:t>
+      </w:r>
+    </w:p>
+    <w:p>
+      <w:pPr>
         <w:jc w:val="center"/>
+        <w:rPr>
+          <w:sz w:val="30"/>
+          <w:szCs w:val="30"/>
+        </w:rPr>
       </w:pPr>
       <m:oMath>
         <m:r>
@@ -1598,6 +1649,637 @@
             <w:sz w:val="30"/>
             <w:szCs w:val="30"/>
           </w:rPr>
+          <m:t>t=</m:t>
+        </m:r>
+        <m:f>
+          <m:fPr>
+            <m:ctrlPr>
+              <w:rPr>
+                <w:rFonts w:ascii="Cambria Math" w:hAnsi="Cambria Math"/>
+                <w:i/>
+                <w:sz w:val="30"/>
+                <w:szCs w:val="30"/>
+              </w:rPr>
+            </m:ctrlPr>
+          </m:fPr>
+          <m:num>
+            <m:r>
+              <w:rPr>
+                <w:rFonts w:ascii="Cambria Math" w:hAnsi="Cambria Math"/>
+                <w:sz w:val="30"/>
+                <w:szCs w:val="30"/>
+              </w:rPr>
+              <m:t>dcos</m:t>
+            </m:r>
+            <m:r>
+              <m:rPr>
+                <m:sty m:val="p"/>
+              </m:rPr>
+              <w:rPr>
+                <w:rFonts w:ascii="Cambria Math" w:hAnsi="Cambria Math"/>
+                <w:sz w:val="30"/>
+                <w:szCs w:val="30"/>
+              </w:rPr>
+              <m:t>α</m:t>
+            </m:r>
+          </m:num>
+          <m:den>
+            <m:r>
+              <w:rPr>
+                <w:rFonts w:ascii="Cambria Math" w:hAnsi="Cambria Math"/>
+                <w:sz w:val="30"/>
+                <w:szCs w:val="30"/>
+              </w:rPr>
+              <m:t>c</m:t>
+            </m:r>
+          </m:den>
+        </m:f>
+      </m:oMath>
+      <w:r>
+        <w:rPr>
+          <w:sz w:val="30"/>
+          <w:szCs w:val="30"/>
+        </w:rPr>
+        <w:t>​</w:t>
+      </w:r>
+    </w:p>
+    <w:p>
+      <w:pPr>
+        <w:ind w:firstLine="720"/>
+      </w:pPr>
+      <w:r>
+        <w:t>Trong trường hợp độ trễ đạt giá trị lớn nhất, nguồn âm nằm trên đường nối giữa hai microphone, tương ứng:</w:t>
+      </w:r>
+    </w:p>
+    <w:p>
+      <m:oMathPara>
+        <m:oMath>
+          <m:r>
+            <m:rPr>
+              <m:sty m:val="p"/>
+            </m:rPr>
+            <w:rPr>
+              <w:rFonts w:ascii="Cambria Math" w:hAnsi="Cambria Math"/>
+            </w:rPr>
+            <m:t>α</m:t>
+          </m:r>
+          <m:r>
+            <m:rPr>
+              <m:sty m:val="p"/>
+            </m:rPr>
+            <w:rPr>
+              <w:rFonts w:ascii="Cambria Math"/>
+            </w:rPr>
+            <m:t>=</m:t>
+          </m:r>
+          <m:sSup>
+            <m:sSupPr>
+              <m:ctrlPr>
+                <w:rPr>
+                  <w:rFonts w:ascii="Cambria Math" w:hAnsi="Cambria Math"/>
+                </w:rPr>
+              </m:ctrlPr>
+            </m:sSupPr>
+            <m:e>
+              <m:r>
+                <w:rPr>
+                  <w:rFonts w:ascii="Cambria Math"/>
+                </w:rPr>
+                <m:t>0</m:t>
+              </m:r>
+            </m:e>
+            <m:sup>
+              <m:r>
+                <w:rPr>
+                  <w:rFonts w:ascii="Cambria Math"/>
+                </w:rPr>
+                <m:t>o</m:t>
+              </m:r>
+            </m:sup>
+          </m:sSup>
+        </m:oMath>
+      </m:oMathPara>
+    </w:p>
+    <w:p>
+      <w:pPr>
+        <w:ind w:firstLine="720"/>
+      </w:pPr>
+      <w:r>
+        <w:t>Khi đó:</w:t>
+      </w:r>
+    </w:p>
+    <w:p>
+      <w:pPr>
+        <w:ind w:firstLine="720"/>
+        <w:jc w:val="center"/>
+      </w:pPr>
+      <m:oMathPara>
+        <m:oMath>
+          <m:r>
+            <w:rPr>
+              <w:rFonts w:ascii="Cambria Math" w:hAnsi="Cambria Math"/>
+            </w:rPr>
+            <m:t>cosα=1</m:t>
+          </m:r>
+        </m:oMath>
+      </m:oMathPara>
+    </w:p>
+    <w:p>
+      <w:pPr>
+        <w:ind w:firstLine="720"/>
+      </w:pPr>
+      <w:r>
+        <w:t>Do đó độ trễ cực đại giữa hai microphone được xác định bởi:</w:t>
+      </w:r>
+    </w:p>
+    <w:p>
+      <m:oMathPara>
+        <m:oMath>
+          <m:sSub>
+            <m:sSubPr>
+              <m:ctrlPr>
+                <w:rPr>
+                  <w:rFonts w:ascii="Cambria Math" w:hAnsi="Cambria Math"/>
+                  <w:i/>
+                </w:rPr>
+              </m:ctrlPr>
+            </m:sSubPr>
+            <m:e>
+              <m:r>
+                <w:rPr>
+                  <w:rFonts w:ascii="Cambria Math" w:hAnsi="Cambria Math"/>
+                </w:rPr>
+                <m:t>t</m:t>
+              </m:r>
+            </m:e>
+            <m:sub>
+              <m:r>
+                <w:rPr>
+                  <w:rFonts w:ascii="Cambria Math" w:hAnsi="Cambria Math"/>
+                </w:rPr>
+                <m:t>max</m:t>
+              </m:r>
+            </m:sub>
+          </m:sSub>
+          <m:r>
+            <w:rPr>
+              <w:rFonts w:ascii="Cambria Math" w:hAnsi="Cambria Math"/>
+            </w:rPr>
+            <m:t>=</m:t>
+          </m:r>
+          <m:f>
+            <m:fPr>
+              <m:ctrlPr>
+                <w:rPr>
+                  <w:rFonts w:ascii="Cambria Math" w:hAnsi="Cambria Math"/>
+                  <w:i/>
+                </w:rPr>
+              </m:ctrlPr>
+            </m:fPr>
+            <m:num>
+              <m:r>
+                <w:rPr>
+                  <w:rFonts w:ascii="Cambria Math" w:hAnsi="Cambria Math"/>
+                </w:rPr>
+                <m:t>d</m:t>
+              </m:r>
+            </m:num>
+            <m:den>
+              <m:r>
+                <w:rPr>
+                  <w:rFonts w:ascii="Cambria Math" w:hAnsi="Cambria Math"/>
+                </w:rPr>
+                <m:t>c</m:t>
+              </m:r>
+            </m:den>
+          </m:f>
+        </m:oMath>
+      </m:oMathPara>
+    </w:p>
+    <w:p>
+      <w:pPr>
+        <w:ind w:firstLine="720"/>
+      </w:pPr>
+      <w:r>
+        <w:t>Thay các giá trị:</w:t>
+      </w:r>
+    </w:p>
+    <w:p>
+      <w:pPr>
+        <w:rPr>
+          <w:rFonts w:ascii="Courier New" w:hAnsi="Courier New" w:cs="Courier New"/>
+        </w:rPr>
+      </w:pPr>
+      <m:oMathPara>
+        <m:oMath>
+          <m:r>
+            <w:rPr>
+              <w:rFonts w:ascii="Cambria Math" w:hAnsi="Cambria Math" w:cs="Courier New"/>
+            </w:rPr>
+            <m:t>d=0.08m</m:t>
+          </m:r>
+          <m:r>
+            <m:rPr>
+              <m:sty m:val="p"/>
+            </m:rPr>
+            <w:rPr>
+              <w:rFonts w:ascii="Courier New" w:hAnsi="Courier New" w:cs="Courier New"/>
+            </w:rPr>
+            <w:br/>
+          </m:r>
+        </m:oMath>
+        <m:oMath>
+          <m:r>
+            <m:rPr>
+              <m:sty m:val="p"/>
+            </m:rPr>
+            <w:rPr>
+              <w:rFonts w:ascii="Courier New" w:hAnsi="Courier New" w:cs="Courier New"/>
+            </w:rPr>
+            <w:br/>
+          </m:r>
+        </m:oMath>
+        <m:oMath>
+          <m:r>
+            <w:rPr>
+              <w:rFonts w:ascii="Cambria Math" w:hAnsi="Cambria Math" w:cs="Courier New"/>
+            </w:rPr>
+            <m:t>c=343 m/s</m:t>
+          </m:r>
+        </m:oMath>
+      </m:oMathPara>
+    </w:p>
+    <w:p>
+      <w:pPr>
+        <w:ind w:firstLine="720"/>
+      </w:pPr>
+      <w:r>
+        <w:t>T</w:t>
+      </w:r>
+      <w:r>
+        <w:t>a được:</w:t>
+      </w:r>
+    </w:p>
+    <w:p>
+      <w:pPr>
+        <w:jc w:val="center"/>
+      </w:pPr>
+      <m:oMath>
+        <m:sSub>
+          <m:sSubPr>
+            <m:ctrlPr>
+              <w:rPr>
+                <w:rFonts w:ascii="Cambria Math" w:hAnsi="Cambria Math"/>
+                <w:i/>
+              </w:rPr>
+            </m:ctrlPr>
+          </m:sSubPr>
+          <m:e>
+            <m:r>
+              <w:rPr>
+                <w:rFonts w:ascii="Cambria Math" w:hAnsi="Cambria Math"/>
+              </w:rPr>
+              <m:t>t</m:t>
+            </m:r>
+          </m:e>
+          <m:sub>
+            <m:r>
+              <w:rPr>
+                <w:rFonts w:ascii="Cambria Math" w:hAnsi="Cambria Math"/>
+              </w:rPr>
+              <m:t>max</m:t>
+            </m:r>
+          </m:sub>
+        </m:sSub>
+        <m:r>
+          <w:rPr>
+            <w:rFonts w:ascii="Cambria Math" w:hAnsi="Cambria Math"/>
+          </w:rPr>
+          <m:t>=</m:t>
+        </m:r>
+        <m:f>
+          <m:fPr>
+            <m:ctrlPr>
+              <w:rPr>
+                <w:rFonts w:ascii="Cambria Math" w:hAnsi="Cambria Math"/>
+                <w:i/>
+              </w:rPr>
+            </m:ctrlPr>
+          </m:fPr>
+          <m:num>
+            <m:r>
+              <w:rPr>
+                <w:rFonts w:ascii="Cambria Math" w:hAnsi="Cambria Math"/>
+              </w:rPr>
+              <m:t>0.08</m:t>
+            </m:r>
+          </m:num>
+          <m:den>
+            <m:r>
+              <w:rPr>
+                <w:rFonts w:ascii="Cambria Math" w:hAnsi="Cambria Math"/>
+              </w:rPr>
+              <m:t>343</m:t>
+            </m:r>
+          </m:den>
+        </m:f>
+      </m:oMath>
+      <w:r>
+        <w:t>=233.2</w:t>
+      </w:r>
+      <w:r>
+        <w:rPr>
+          <w:rStyle w:val="mord"/>
+        </w:rPr>
+        <w:t>μs</w:t>
+      </w:r>
+    </w:p>
+    <w:p>
+      <w:pPr>
+        <w:ind w:firstLine="720"/>
+      </w:pPr>
+    </w:p>
+    <w:p>
+      <w:pPr>
+        <w:ind w:firstLine="720"/>
+      </w:pPr>
+      <w:r>
+        <w:t>Như vậy độ lệch thời gian đến lớn nhất giữa hai microphone trong mảng là khoảng 233 μs.</w:t>
+      </w:r>
+    </w:p>
+    <w:p>
+      <w:pPr>
+        <w:ind w:firstLine="720"/>
+      </w:pPr>
+      <w:r>
+        <w:t>Tín hiệu âm thanh trong đề tài được lấy mẫu với tần số:</w:t>
+      </w:r>
+    </w:p>
+    <w:p>
+      <w:pPr>
+        <w:spacing w:before="120" w:after="120"/>
+        <w:ind w:firstLine="720"/>
+        <w:jc w:val="center"/>
+      </w:pPr>
+      <w:r>
+        <w:t>fs=16000Hz</w:t>
+      </w:r>
+    </w:p>
+    <w:p>
+      <w:pPr>
+        <w:ind w:firstLine="720"/>
+      </w:pPr>
+      <w:r>
+        <w:t>Số mẫu tương ứng với độ trễ cực đại được xác định theo công thức:</w:t>
+      </w:r>
+    </w:p>
+    <w:p>
+      <w:pPr>
+        <w:spacing w:before="120" w:after="120"/>
+        <w:ind w:firstLine="720"/>
+        <w:jc w:val="center"/>
+      </w:pPr>
+      <m:oMathPara>
+        <m:oMath>
+          <m:sSub>
+            <m:sSubPr>
+              <m:ctrlPr>
+                <w:rPr>
+                  <w:rFonts w:ascii="Cambria Math" w:hAnsi="Cambria Math"/>
+                  <w:i/>
+                </w:rPr>
+              </m:ctrlPr>
+            </m:sSubPr>
+            <m:e>
+              <m:r>
+                <w:rPr>
+                  <w:rFonts w:ascii="Cambria Math" w:hAnsi="Cambria Math"/>
+                </w:rPr>
+                <m:t>N</m:t>
+              </m:r>
+            </m:e>
+            <m:sub>
+              <m:r>
+                <w:rPr>
+                  <w:rFonts w:ascii="Cambria Math" w:hAnsi="Cambria Math"/>
+                </w:rPr>
+                <m:t>delay</m:t>
+              </m:r>
+            </m:sub>
+          </m:sSub>
+          <m:r>
+            <w:rPr>
+              <w:rFonts w:ascii="Cambria Math" w:hAnsi="Cambria Math"/>
+            </w:rPr>
+            <m:t xml:space="preserve">= </m:t>
+          </m:r>
+          <m:sSub>
+            <m:sSubPr>
+              <m:ctrlPr>
+                <w:rPr>
+                  <w:rFonts w:ascii="Cambria Math" w:hAnsi="Cambria Math"/>
+                  <w:i/>
+                </w:rPr>
+              </m:ctrlPr>
+            </m:sSubPr>
+            <m:e>
+              <m:r>
+                <w:rPr>
+                  <w:rFonts w:ascii="Cambria Math" w:hAnsi="Cambria Math"/>
+                </w:rPr>
+                <m:t>t</m:t>
+              </m:r>
+            </m:e>
+            <m:sub>
+              <m:r>
+                <w:rPr>
+                  <w:rFonts w:ascii="Cambria Math" w:hAnsi="Cambria Math"/>
+                </w:rPr>
+                <m:t xml:space="preserve">max </m:t>
+              </m:r>
+            </m:sub>
+          </m:sSub>
+          <m:sSub>
+            <m:sSubPr>
+              <m:ctrlPr>
+                <w:rPr>
+                  <w:rFonts w:ascii="Cambria Math" w:hAnsi="Cambria Math"/>
+                  <w:i/>
+                </w:rPr>
+              </m:ctrlPr>
+            </m:sSubPr>
+            <m:e>
+              <m:r>
+                <w:rPr>
+                  <w:rFonts w:ascii="Cambria Math" w:hAnsi="Cambria Math"/>
+                </w:rPr>
+                <m:t xml:space="preserve"> × f</m:t>
+              </m:r>
+            </m:e>
+            <m:sub>
+              <m:r>
+                <w:rPr>
+                  <w:rFonts w:ascii="Cambria Math" w:hAnsi="Cambria Math"/>
+                </w:rPr>
+                <m:t>s</m:t>
+              </m:r>
+            </m:sub>
+          </m:sSub>
+          <m:r>
+            <m:rPr>
+              <m:sty m:val="p"/>
+            </m:rPr>
+            <w:rPr>
+              <w:rStyle w:val="mord"/>
+              <w:rFonts w:ascii="Cambria Math" w:hAnsi="Cambria Math"/>
+            </w:rPr>
+            <m:t>=233.2</m:t>
+          </m:r>
+          <m:r>
+            <m:rPr>
+              <m:sty m:val="p"/>
+            </m:rPr>
+            <w:rPr>
+              <w:rStyle w:val="mbin"/>
+              <w:rFonts w:ascii="Cambria Math" w:hAnsi="Cambria Math"/>
+            </w:rPr>
+            <m:t>×</m:t>
+          </m:r>
+          <m:sSup>
+            <m:sSupPr>
+              <m:ctrlPr>
+                <w:rPr>
+                  <w:rStyle w:val="mord"/>
+                  <w:rFonts w:ascii="Cambria Math" w:hAnsi="Cambria Math"/>
+                  <w:bCs/>
+                </w:rPr>
+              </m:ctrlPr>
+            </m:sSupPr>
+            <m:e>
+              <m:r>
+                <w:rPr>
+                  <w:rStyle w:val="mord"/>
+                  <w:rFonts w:ascii="Cambria Math" w:hAnsi="Cambria Math"/>
+                </w:rPr>
+                <m:t>10</m:t>
+              </m:r>
+            </m:e>
+            <m:sup>
+              <m:r>
+                <w:rPr>
+                  <w:rStyle w:val="mord"/>
+                  <w:rFonts w:ascii="Cambria Math" w:hAnsi="Cambria Math"/>
+                </w:rPr>
+                <m:t>-6</m:t>
+              </m:r>
+            </m:sup>
+          </m:sSup>
+          <m:r>
+            <m:rPr>
+              <m:sty m:val="p"/>
+            </m:rPr>
+            <w:rPr>
+              <w:rStyle w:val="mbin"/>
+              <w:rFonts w:ascii="Cambria Math" w:hAnsi="Cambria Math"/>
+            </w:rPr>
+            <m:t>×</m:t>
+          </m:r>
+          <m:r>
+            <m:rPr>
+              <m:sty m:val="p"/>
+            </m:rPr>
+            <w:rPr>
+              <w:rStyle w:val="mord"/>
+              <w:rFonts w:ascii="Cambria Math" w:hAnsi="Cambria Math"/>
+            </w:rPr>
+            <m:t>16000</m:t>
+          </m:r>
+          <m:r>
+            <m:rPr>
+              <m:sty m:val="p"/>
+            </m:rPr>
+            <w:rPr>
+              <w:rStyle w:val="mrel"/>
+              <w:rFonts w:ascii="Cambria Math" w:hAnsi="Cambria Math"/>
+            </w:rPr>
+            <m:t>=</m:t>
+          </m:r>
+          <m:r>
+            <m:rPr>
+              <m:sty m:val="p"/>
+            </m:rPr>
+            <w:rPr>
+              <w:rStyle w:val="mord"/>
+              <w:rFonts w:ascii="Cambria Math" w:hAnsi="Cambria Math"/>
+            </w:rPr>
+            <m:t>3.73≈4 samples</m:t>
+          </m:r>
+        </m:oMath>
+      </m:oMathPara>
+    </w:p>
+    <w:p>
+      <w:pPr>
+        <w:ind w:firstLine="720"/>
+      </w:pPr>
+      <w:r>
+        <w:t>Giá trị độ trễ cực đại được sử dụng để xây dựng bảng mẫu độ trễ cho mảng microphone. Mỗi hướng khảo sát trong không gian sẽ tương ứng với một tổ hợp độ trễ nằm trong khoảng:</w:t>
+      </w:r>
+    </w:p>
+    <w:p>
+      <w:pPr>
+        <w:spacing w:before="120" w:after="120"/>
+        <w:jc w:val="center"/>
+      </w:pPr>
+      <w:r>
+        <w:t>[−4,+4]</w:t>
+      </w:r>
+      <w:r>
+        <w:t xml:space="preserve"> mẫu</w:t>
+      </w:r>
+    </w:p>
+    <w:p>
+      <w:r>
+        <w:t>Các vector độ trễ này được lưu trữ dưới dạng bảng Delay Map và được sử dụng làm dữ liệu tham chiếu trong quá trình xác định hướng đến của nguồn âm. Sau khi thuật toán GCC-PHAT tính toán được các giá trị TDOA thực tế, hệ thống tiến hành so sánh với các vector trong bảng mẫu để tìm ra hướng có sai số nhỏ nhất.</w:t>
+      </w:r>
+    </w:p>
+    <w:p>
+      <w:pPr>
+        <w:pStyle w:val="Heading3"/>
+      </w:pPr>
+      <w:r>
+        <w:t>Biến đổi Fourier nhanh FFT 1024 điểm</w:t>
+      </w:r>
+    </w:p>
+    <w:p>
+      <w:pPr>
+        <w:ind w:firstLine="720"/>
+      </w:pPr>
+      <w:r>
+        <w:t>Trong các hệ thống xử lý tín hiệu số hiện đại, việc chuyển đổi tín hiệu từ miền thời gian sang miền tần số đóng vai trò rất quan trọng trong quá trình phân tích và xử lý tín hiệu. Một trong những công cụ được sử dụng phổ biến nhất là biến đổi Fourier nhanh (Fast Fourier Transform – FFT). FFT là thuật toán tối ưu của biến đổi Fourier rời rạc (Discrete Fourier Transform – DFT), cho phép giảm đáng kể số phép tính cần thực hiện và tăng tốc độ xử lý của hệ thống.</w:t>
+      </w:r>
+    </w:p>
+    <w:p>
+      <w:pPr>
+        <w:ind w:firstLine="720"/>
+      </w:pPr>
+      <w:r>
+        <w:t>Đối với tín hiệu rời rạc x(n) gồm N mẫu, biến đổi Fourier rời rạc được biểu diễn theo công thức:</w:t>
+      </w:r>
+    </w:p>
+    <w:p>
+      <w:pPr>
+        <w:spacing w:before="120" w:after="120"/>
+        <w:ind w:firstLine="720"/>
+        <w:jc w:val="center"/>
+      </w:pPr>
+      <m:oMath>
+        <m:r>
+          <w:rPr>
+            <w:rFonts w:ascii="Cambria Math" w:hAnsi="Cambria Math"/>
+            <w:sz w:val="30"/>
+            <w:szCs w:val="30"/>
+          </w:rPr>
+          <w:lastRenderedPageBreak/>
           <m:t>X</m:t>
         </m:r>
         <m:d>
@@ -1957,11 +2639,7 @@
         </w:rPr>
       </w:pPr>
       <w:r>
-        <w:t xml:space="preserve">Việc lựa chọn FFT 1024 điểm giúp hệ thống đạt được sự cân bằng giữa độ chính xác của phép phân tích phổ và thời gian tính toán. Sau khi thực hiện FFT, tín </w:t>
-      </w:r>
-      <w:r>
-        <w:lastRenderedPageBreak/>
-        <w:t>hiệu âm thanh được biểu diễn trong miền tần số và được sử dụng làm đầu vào cho thuật toán GCC-PHAT nhằm xác định độ trễ thời gian đến giữa các microphone.</w:t>
+        <w:t>Việc lựa chọn FFT 1024 điểm giúp hệ thống đạt được sự cân bằng giữa độ chính xác của phép phân tích phổ và thời gian tính toán. Sau khi thực hiện FFT, tín hiệu âm thanh được biểu diễn trong miền tần số và được sử dụng làm đầu vào cho thuật toán GCC-PHAT nhằm xác định độ trễ thời gian đến giữa các microphone.</w:t>
       </w:r>
     </w:p>
     <w:p>
@@ -1969,7 +2647,7 @@
         <w:pStyle w:val="Heading3"/>
       </w:pPr>
       <w:r>
-        <w:t>Ước lượng TDOA bằng tương quan chéo tổng quát GCC-PHAT</w:t>
+        <w:t>Ước lượng TDOA bằng GCC-PHAT (1 cặp)</w:t>
       </w:r>
     </w:p>
     <w:p>
@@ -2347,6 +3025,7 @@
           <w:sz w:val="26"/>
           <w:szCs w:val="26"/>
         </w:rPr>
+        <w:lastRenderedPageBreak/>
         <w:t>Trong đó:</w:t>
       </w:r>
     </w:p>
@@ -2902,19 +3581,159 @@
           <w:sz w:val="26"/>
           <w:szCs w:val="26"/>
         </w:rPr>
-        <w:lastRenderedPageBreak/>
         <w:t>Bằng cách chuẩn hóa biên độ và chỉ giữ lại thông tin pha, GCC-PHAT tạo ra đỉnh tương quan sắc nét hơn so với tương quan chéo thông thường (basic cross-correlation), giúp ước lượng TDOA chính xác hơn, đặc biệt trong môi trường có nhiễu nền và phản xạ tường (reverberation). Đây là lý do GCC-PHAT được lựa chọn làm phương pháp ước lượng TDOA chính trong đề tài này.</w:t>
       </w:r>
     </w:p>
     <w:p>
       <w:pPr>
         <w:pStyle w:val="Heading3"/>
+      </w:pPr>
+      <w:r>
+        <w:t>Tính 4 giá trị độ trễ cho 4 cặp mic đối tâm (liền GCC-PHAT)</w:t>
+      </w:r>
+    </w:p>
+    <w:p>
+      <w:pPr>
+        <w:ind w:firstLine="720"/>
+      </w:pPr>
+      <w:r>
+        <w:t>Trong đề tài này, bốn cặp microphone được lựa chọn để thực hiện phép đo độ trễ gồm:</w:t>
+      </w:r>
+    </w:p>
+    <w:p>
+      <w:pPr>
+        <w:ind w:firstLine="720"/>
         <w:rPr>
+          <w:rStyle w:val="HTMLCode"/>
+          <w:rFonts w:ascii="Times New Roman" w:hAnsi="Times New Roman" w:cs="Times New Roman"/>
+          <w:sz w:val="26"/>
           <w:szCs w:val="26"/>
         </w:rPr>
       </w:pPr>
-      <w:r>
-        <w:t>Xây dựng bảng mẫu độ trễ cho mảng microphone</w:t>
+      <m:oMathPara>
+        <m:oMath>
+          <m:r>
+            <w:rPr>
+              <w:rStyle w:val="HTMLCode"/>
+              <w:rFonts w:ascii="Cambria Math" w:hAnsi="Cambria Math" w:cs="Times New Roman"/>
+              <w:sz w:val="26"/>
+              <w:szCs w:val="26"/>
+            </w:rPr>
+            <m:t xml:space="preserve">(1,2), (2,3), (3,4), </m:t>
+          </m:r>
+          <m:d>
+            <m:dPr>
+              <m:ctrlPr>
+                <w:rPr>
+                  <w:rStyle w:val="HTMLCode"/>
+                  <w:rFonts w:ascii="Cambria Math" w:hAnsi="Cambria Math" w:cs="Times New Roman"/>
+                  <w:i/>
+                  <w:sz w:val="26"/>
+                  <w:szCs w:val="26"/>
+                </w:rPr>
+              </m:ctrlPr>
+            </m:dPr>
+            <m:e>
+              <m:r>
+                <w:rPr>
+                  <w:rStyle w:val="HTMLCode"/>
+                  <w:rFonts w:ascii="Cambria Math" w:hAnsi="Cambria Math" w:cs="Times New Roman"/>
+                  <w:sz w:val="26"/>
+                  <w:szCs w:val="26"/>
+                </w:rPr>
+                <m:t>4,1</m:t>
+              </m:r>
+            </m:e>
+          </m:d>
+        </m:oMath>
+      </m:oMathPara>
+    </w:p>
+    <w:p>
+      <w:pPr>
+        <w:ind w:firstLine="720"/>
+      </w:pPr>
+      <w:r>
+        <w:t>Thông qua thuật toán GCC-PHAT, hệ thống xác định được các giá trị độ trễ:</w:t>
+      </w:r>
+    </w:p>
+    <w:p>
+      <w:pPr>
+        <w:ind w:firstLine="720"/>
+      </w:pPr>
+      <m:oMathPara>
+        <m:oMath>
+          <m:r>
+            <w:rPr>
+              <w:rFonts w:ascii="Cambria Math" w:hAnsi="Cambria Math"/>
+            </w:rPr>
+            <m:t>τ12, τ23, τ34, τ41</m:t>
+          </m:r>
+        </m:oMath>
+      </m:oMathPara>
+    </w:p>
+    <w:p>
+      <w:pPr>
+        <w:ind w:firstLine="720"/>
+      </w:pPr>
+      <w:r>
+        <w:t>Các giá trị này được tổng hợp thành vector độ trễ thực tế:</w:t>
+      </w:r>
+    </w:p>
+    <w:p>
+      <w:pPr>
+        <w:ind w:firstLine="720"/>
+        <w:jc w:val="center"/>
+      </w:pPr>
+      <m:oMath>
+        <m:r>
+          <w:rPr>
+            <w:rFonts w:ascii="Cambria Math" w:hAnsi="Cambria Math"/>
+          </w:rPr>
+          <w:lastRenderedPageBreak/>
+          <m:t>P=</m:t>
+        </m:r>
+        <m:d>
+          <m:dPr>
+            <m:begChr m:val="["/>
+            <m:endChr m:val="]"/>
+            <m:ctrlPr>
+              <w:rPr>
+                <w:rFonts w:ascii="Cambria Math" w:hAnsi="Cambria Math"/>
+                <w:i/>
+              </w:rPr>
+            </m:ctrlPr>
+          </m:dPr>
+          <m:e>
+            <m:r>
+              <w:rPr>
+                <w:rFonts w:ascii="Cambria Math" w:hAnsi="Cambria Math"/>
+              </w:rPr>
+              <m:t>τ12   τ23   τ34   τ41</m:t>
+            </m:r>
+          </m:e>
+        </m:d>
+      </m:oMath>
+      <w:r>
+        <w:t xml:space="preserve">                    </w:t>
+      </w:r>
+      <w:r>
+        <w:t>(2.10</w:t>
+      </w:r>
+      <w:r>
+        <w:t>)</w:t>
+      </w:r>
+    </w:p>
+    <w:p>
+      <w:r>
+        <w:t>Vector P chứa thông tin đặc trưng về vị trí tương đối của nguồn âm đối với mảng microphone. Thông tin này sẽ được sử dụng trong bước tiếp theo để xác định hướng đến của nguồn âm.</w:t>
+      </w:r>
+    </w:p>
+    <w:p>
+      <w:pPr>
+        <w:pStyle w:val="Heading3"/>
+      </w:pPr>
+      <w:r>
+        <w:t>Xây dựng bảng mẫu độ trễ — Delay Map lag(az,k)=(Fs/C)·2R·cos(az−φk)</w:t>
       </w:r>
     </w:p>
     <w:p>
@@ -3106,166 +3925,15 @@
     </w:p>
     <w:p>
       <w:pPr>
+        <w:ind w:firstLine="720"/>
+      </w:pPr>
+    </w:p>
+    <w:p>
+      <w:pPr>
         <w:pStyle w:val="Heading3"/>
       </w:pPr>
       <w:r>
-        <w:t>Tính toán bốn giá trị độ trễ giữa các cặp microphone</w:t>
-      </w:r>
-    </w:p>
-    <w:p>
-      <w:pPr>
-        <w:ind w:firstLine="720"/>
-      </w:pPr>
-      <w:r>
-        <w:t>Trong đề tài này, bốn cặp microphone được lựa chọn để thực hiện phép đo độ trễ gồm:</w:t>
-      </w:r>
-    </w:p>
-    <w:p>
-      <w:pPr>
-        <w:ind w:firstLine="720"/>
-        <w:rPr>
-          <w:rStyle w:val="HTMLCode"/>
-          <w:rFonts w:ascii="Times New Roman" w:hAnsi="Times New Roman" w:cs="Times New Roman"/>
-          <w:sz w:val="26"/>
-          <w:szCs w:val="26"/>
-        </w:rPr>
-      </w:pPr>
-      <m:oMathPara>
-        <m:oMath>
-          <m:r>
-            <w:rPr>
-              <w:rStyle w:val="HTMLCode"/>
-              <w:rFonts w:ascii="Cambria Math" w:hAnsi="Cambria Math" w:cs="Times New Roman"/>
-              <w:sz w:val="26"/>
-              <w:szCs w:val="26"/>
-            </w:rPr>
-            <m:t xml:space="preserve">(1,2), (2,3), (3,4), </m:t>
-          </m:r>
-          <m:d>
-            <m:dPr>
-              <m:ctrlPr>
-                <w:rPr>
-                  <w:rStyle w:val="HTMLCode"/>
-                  <w:rFonts w:ascii="Cambria Math" w:hAnsi="Cambria Math" w:cs="Times New Roman"/>
-                  <w:i/>
-                  <w:sz w:val="26"/>
-                  <w:szCs w:val="26"/>
-                </w:rPr>
-              </m:ctrlPr>
-            </m:dPr>
-            <m:e>
-              <m:r>
-                <w:rPr>
-                  <w:rStyle w:val="HTMLCode"/>
-                  <w:rFonts w:ascii="Cambria Math" w:hAnsi="Cambria Math" w:cs="Times New Roman"/>
-                  <w:sz w:val="26"/>
-                  <w:szCs w:val="26"/>
-                </w:rPr>
-                <m:t>4,1</m:t>
-              </m:r>
-            </m:e>
-          </m:d>
-        </m:oMath>
-      </m:oMathPara>
-    </w:p>
-    <w:p>
-      <w:pPr>
-        <w:ind w:firstLine="720"/>
-      </w:pPr>
-      <w:r>
-        <w:t>Thông qua thuật toán GCC-PHAT, hệ thống xác định được các giá trị độ trễ:</w:t>
-      </w:r>
-    </w:p>
-    <w:p>
-      <w:pPr>
-        <w:ind w:firstLine="720"/>
-      </w:pPr>
-      <m:oMathPara>
-        <m:oMath>
-          <m:r>
-            <w:rPr>
-              <w:rFonts w:ascii="Cambria Math" w:hAnsi="Cambria Math"/>
-            </w:rPr>
-            <w:lastRenderedPageBreak/>
-            <m:t>τ12, τ23, τ34, τ41</m:t>
-          </m:r>
-        </m:oMath>
-      </m:oMathPara>
-    </w:p>
-    <w:p>
-      <w:pPr>
-        <w:ind w:firstLine="720"/>
-      </w:pPr>
-      <w:r>
-        <w:t>Các giá trị này được tổng hợp thành vector độ trễ thực tế:</w:t>
-      </w:r>
-    </w:p>
-    <w:p>
-      <w:pPr>
-        <w:ind w:firstLine="720"/>
-        <w:jc w:val="center"/>
-      </w:pPr>
-      <m:oMath>
-        <m:r>
-          <w:rPr>
-            <w:rFonts w:ascii="Cambria Math" w:hAnsi="Cambria Math"/>
-          </w:rPr>
-          <m:t>P=</m:t>
-        </m:r>
-        <m:d>
-          <m:dPr>
-            <m:begChr m:val="["/>
-            <m:endChr m:val="]"/>
-            <m:ctrlPr>
-              <w:rPr>
-                <w:rFonts w:ascii="Cambria Math" w:hAnsi="Cambria Math"/>
-                <w:i/>
-              </w:rPr>
-            </m:ctrlPr>
-          </m:dPr>
-          <m:e>
-            <m:r>
-              <w:rPr>
-                <w:rFonts w:ascii="Cambria Math" w:hAnsi="Cambria Math"/>
-              </w:rPr>
-              <m:t>τ12   τ23   τ34   τ41</m:t>
-            </m:r>
-          </m:e>
-        </m:d>
-      </m:oMath>
-      <w:r>
-        <w:t xml:space="preserve">                    </w:t>
-      </w:r>
-      <w:r>
-        <w:t>(2.10</w:t>
-      </w:r>
-      <w:r>
-        <w:t>)</w:t>
-      </w:r>
-    </w:p>
-    <w:p>
-      <w:pPr>
-        <w:ind w:firstLine="720"/>
-      </w:pPr>
-      <w:r>
-        <w:t xml:space="preserve">Vector </w:t>
-      </w:r>
-      <w:r>
-        <w:rPr>
-          <w:rStyle w:val="mord"/>
-        </w:rPr>
-        <w:t>P</w:t>
-      </w:r>
-      <w:r>
-        <w:t xml:space="preserve"> chứa thông tin đặc trưng về vị trí tương đối của nguồn âm đối với mảng microphone. Thông tin này sẽ được sử dụng trong bước tiếp theo để xác định hướng đến của nguồn âm.</w:t>
-      </w:r>
-    </w:p>
-    <w:p>
-      <w:pPr>
-        <w:pStyle w:val="Heading3"/>
-      </w:pPr>
-      <w:r>
-        <w:t>Xác định hướng đến DOA bằng phương pháp so khớp mẫu</w:t>
+        <w:t>Xác định DOA bằng so khớp mẫu (residual nhỏ nhất)</w:t>
       </w:r>
     </w:p>
     <w:p>
@@ -3583,7 +4251,33 @@
         <w:pStyle w:val="Heading3"/>
       </w:pPr>
       <w:r>
-        <w:t>Đánh giá ưu nhược điểm phương pháp TDOA</w:t>
+        <w:t>Phát hiện sự kiện âm (clap gate) &amp; ước lượng nền nhiễu EMA</w:t>
+      </w:r>
+    </w:p>
+    <w:p>
+      <w:r>
+        <w:t>[Nội dung trình bày về ngưỡng phát hiện sự kiện âm (clap gate) và ước lượng nền nhiễu bằng trung bình trượt mũ EMA sẽ được bổ sung.]</w:t>
+      </w:r>
+    </w:p>
+    <w:p>
+      <w:pPr>
+        <w:pStyle w:val="Heading3"/>
+      </w:pPr>
+      <w:r>
+        <w:t>Kết hợp đa block bằng bỏ phiếu theo cửa sổ thời gian</w:t>
+      </w:r>
+    </w:p>
+    <w:p>
+      <w:r>
+        <w:t>[Nội dung trình bày về cơ chế kết hợp kết quả từ nhiều block bằng bỏ phiếu theo cửa sổ thời gian sẽ được bổ sung.]</w:t>
+      </w:r>
+    </w:p>
+    <w:p>
+      <w:pPr>
+        <w:pStyle w:val="Heading3"/>
+      </w:pPr>
+      <w:r>
+        <w:t>Đánh giá ưu/nhược điểm phương pháp TDOA</w:t>
       </w:r>
     </w:p>
     <w:p>
@@ -3616,7 +4310,6 @@
         </w:numPr>
       </w:pPr>
       <w:r>
-        <w:lastRenderedPageBreak/>
         <w:t>Đơn giản về mặt tính toán: TDOA chỉ yêu cầu phép tính tương quan chéo và tìm đỉnh, phù hợp triển khai trên vi điều khiển STM32 với tài nguyên hạn chế.</w:t>
       </w:r>
     </w:p>
@@ -3641,6 +4334,7 @@
         </w:numPr>
       </w:pPr>
       <w:r>
+        <w:lastRenderedPageBreak/>
         <w:t>Hoạt động thụ động (passive): hệ thống không cần phát tín hiệu, chỉ thu nhận âm thanh từ môi trường, phù hợp cho ứng dụng giám sát và robot di động.</w:t>
       </w:r>
     </w:p>
@@ -3711,682 +4405,8 @@
     </w:p>
     <w:p>
       <w:pPr>
-        <w:pStyle w:val="Heading2"/>
-      </w:pPr>
-      <w:bookmarkStart w:id="8" w:name="_Toc225510240"/>
-      <w:r>
-        <w:t>Tính toán độ trễ của microphone</w:t>
-      </w:r>
-    </w:p>
-    <w:p>
-      <w:pPr>
         <w:ind w:firstLine="720"/>
       </w:pPr>
-      <w:r>
-        <w:t>Sau khi trình bày cơ sở lý thuyết của phương pháp TDOA, phần này tiến hành áp dụng các công thức đã xây dựng cho mảng microphone được sử dụng trong đề tài. Việc xác định độ trễ cực đại giữa các microphone là cơ sở để giới hạn phạm vi tìm kiếm của thuật toán GCC-PHAT, đồng thời phục vụ quá trình xây dựng bảng mẫu độ trễ (Delay Map).</w:t>
-      </w:r>
-    </w:p>
-    <w:p>
-      <w:pPr>
-        <w:ind w:firstLine="720"/>
-      </w:pPr>
-      <w:r>
-        <w:t>Trong đề tài, mảng microphone gồm bốn microphone INMP441 được bố trí với khoảng cách giữa hai microphone liền kề là:</w:t>
-      </w:r>
-    </w:p>
-    <w:p>
-      <w:pPr>
-        <w:ind w:firstLine="720"/>
-        <w:rPr>
-          <w:rFonts w:ascii="Courier New" w:hAnsi="Courier New" w:cs="Courier New"/>
-        </w:rPr>
-      </w:pPr>
-      <m:oMathPara>
-        <m:oMath>
-          <m:r>
-            <w:rPr>
-              <w:rFonts w:ascii="Cambria Math" w:hAnsi="Cambria Math" w:cs="Courier New"/>
-            </w:rPr>
-            <m:t>d = 80 mm = 0.08 m</m:t>
-          </m:r>
-        </m:oMath>
-      </m:oMathPara>
-    </w:p>
-    <w:p>
-      <w:pPr>
-        <w:ind w:firstLine="720"/>
-      </w:pPr>
-      <w:r>
-        <w:lastRenderedPageBreak/>
-        <w:t>Theo lý thuyết TDOA đã trình bày ở mục 2.1, độ lệch thời gian đến giữa hai microphone được xác định bởi:</w:t>
-      </w:r>
-    </w:p>
-    <w:p>
-      <w:pPr>
-        <w:jc w:val="center"/>
-        <w:rPr>
-          <w:sz w:val="30"/>
-          <w:szCs w:val="30"/>
-        </w:rPr>
-      </w:pPr>
-      <m:oMath>
-        <m:r>
-          <w:rPr>
-            <w:rFonts w:ascii="Cambria Math" w:hAnsi="Cambria Math"/>
-            <w:sz w:val="30"/>
-            <w:szCs w:val="30"/>
-          </w:rPr>
-          <m:t>t=</m:t>
-        </m:r>
-        <m:f>
-          <m:fPr>
-            <m:ctrlPr>
-              <w:rPr>
-                <w:rFonts w:ascii="Cambria Math" w:hAnsi="Cambria Math"/>
-                <w:i/>
-                <w:sz w:val="30"/>
-                <w:szCs w:val="30"/>
-              </w:rPr>
-            </m:ctrlPr>
-          </m:fPr>
-          <m:num>
-            <m:r>
-              <w:rPr>
-                <w:rFonts w:ascii="Cambria Math" w:hAnsi="Cambria Math"/>
-                <w:sz w:val="30"/>
-                <w:szCs w:val="30"/>
-              </w:rPr>
-              <m:t>dcos</m:t>
-            </m:r>
-            <m:r>
-              <m:rPr>
-                <m:sty m:val="p"/>
-              </m:rPr>
-              <w:rPr>
-                <w:rFonts w:ascii="Cambria Math" w:hAnsi="Cambria Math"/>
-                <w:sz w:val="30"/>
-                <w:szCs w:val="30"/>
-              </w:rPr>
-              <m:t>α</m:t>
-            </m:r>
-          </m:num>
-          <m:den>
-            <m:r>
-              <w:rPr>
-                <w:rFonts w:ascii="Cambria Math" w:hAnsi="Cambria Math"/>
-                <w:sz w:val="30"/>
-                <w:szCs w:val="30"/>
-              </w:rPr>
-              <m:t>c</m:t>
-            </m:r>
-          </m:den>
-        </m:f>
-      </m:oMath>
-      <w:r>
-        <w:rPr>
-          <w:sz w:val="30"/>
-          <w:szCs w:val="30"/>
-        </w:rPr>
-        <w:t>​</w:t>
-      </w:r>
-    </w:p>
-    <w:p>
-      <w:pPr>
-        <w:ind w:firstLine="720"/>
-      </w:pPr>
-      <w:r>
-        <w:t>Trong trường hợp độ trễ đạt giá trị lớn nhất, nguồn âm nằm trên đường nối giữa hai microphone, tương ứng:</w:t>
-      </w:r>
-    </w:p>
-    <w:p>
-      <m:oMathPara>
-        <m:oMath>
-          <m:r>
-            <m:rPr>
-              <m:sty m:val="p"/>
-            </m:rPr>
-            <w:rPr>
-              <w:rFonts w:ascii="Cambria Math" w:hAnsi="Cambria Math"/>
-            </w:rPr>
-            <m:t>α</m:t>
-          </m:r>
-          <m:r>
-            <m:rPr>
-              <m:sty m:val="p"/>
-            </m:rPr>
-            <w:rPr>
-              <w:rFonts w:ascii="Cambria Math"/>
-            </w:rPr>
-            <m:t>=</m:t>
-          </m:r>
-          <m:sSup>
-            <m:sSupPr>
-              <m:ctrlPr>
-                <w:rPr>
-                  <w:rFonts w:ascii="Cambria Math" w:hAnsi="Cambria Math"/>
-                </w:rPr>
-              </m:ctrlPr>
-            </m:sSupPr>
-            <m:e>
-              <m:r>
-                <w:rPr>
-                  <w:rFonts w:ascii="Cambria Math"/>
-                </w:rPr>
-                <m:t>0</m:t>
-              </m:r>
-            </m:e>
-            <m:sup>
-              <m:r>
-                <w:rPr>
-                  <w:rFonts w:ascii="Cambria Math"/>
-                </w:rPr>
-                <m:t>o</m:t>
-              </m:r>
-            </m:sup>
-          </m:sSup>
-        </m:oMath>
-      </m:oMathPara>
-    </w:p>
-    <w:p>
-      <w:pPr>
-        <w:ind w:firstLine="720"/>
-      </w:pPr>
-      <w:r>
-        <w:t>Khi đó:</w:t>
-      </w:r>
-    </w:p>
-    <w:p>
-      <w:pPr>
-        <w:ind w:firstLine="720"/>
-        <w:jc w:val="center"/>
-      </w:pPr>
-      <m:oMathPara>
-        <m:oMath>
-          <m:r>
-            <w:rPr>
-              <w:rFonts w:ascii="Cambria Math" w:hAnsi="Cambria Math"/>
-            </w:rPr>
-            <m:t>cosα=1</m:t>
-          </m:r>
-        </m:oMath>
-      </m:oMathPara>
-    </w:p>
-    <w:p>
-      <w:pPr>
-        <w:ind w:firstLine="720"/>
-      </w:pPr>
-      <w:r>
-        <w:t>Do đó độ trễ cực đại giữa hai microphone được xác định bởi:</w:t>
-      </w:r>
-    </w:p>
-    <w:p>
-      <m:oMathPara>
-        <m:oMath>
-          <m:sSub>
-            <m:sSubPr>
-              <m:ctrlPr>
-                <w:rPr>
-                  <w:rFonts w:ascii="Cambria Math" w:hAnsi="Cambria Math"/>
-                  <w:i/>
-                </w:rPr>
-              </m:ctrlPr>
-            </m:sSubPr>
-            <m:e>
-              <m:r>
-                <w:rPr>
-                  <w:rFonts w:ascii="Cambria Math" w:hAnsi="Cambria Math"/>
-                </w:rPr>
-                <m:t>t</m:t>
-              </m:r>
-            </m:e>
-            <m:sub>
-              <m:r>
-                <w:rPr>
-                  <w:rFonts w:ascii="Cambria Math" w:hAnsi="Cambria Math"/>
-                </w:rPr>
-                <m:t>max</m:t>
-              </m:r>
-            </m:sub>
-          </m:sSub>
-          <m:r>
-            <w:rPr>
-              <w:rFonts w:ascii="Cambria Math" w:hAnsi="Cambria Math"/>
-            </w:rPr>
-            <m:t>=</m:t>
-          </m:r>
-          <m:f>
-            <m:fPr>
-              <m:ctrlPr>
-                <w:rPr>
-                  <w:rFonts w:ascii="Cambria Math" w:hAnsi="Cambria Math"/>
-                  <w:i/>
-                </w:rPr>
-              </m:ctrlPr>
-            </m:fPr>
-            <m:num>
-              <m:r>
-                <w:rPr>
-                  <w:rFonts w:ascii="Cambria Math" w:hAnsi="Cambria Math"/>
-                </w:rPr>
-                <m:t>d</m:t>
-              </m:r>
-            </m:num>
-            <m:den>
-              <m:r>
-                <w:rPr>
-                  <w:rFonts w:ascii="Cambria Math" w:hAnsi="Cambria Math"/>
-                </w:rPr>
-                <m:t>c</m:t>
-              </m:r>
-            </m:den>
-          </m:f>
-        </m:oMath>
-      </m:oMathPara>
-    </w:p>
-    <w:p>
-      <w:pPr>
-        <w:ind w:firstLine="720"/>
-      </w:pPr>
-      <w:r>
-        <w:t>Thay các giá trị:</w:t>
-      </w:r>
-    </w:p>
-    <w:p>
-      <w:pPr>
-        <w:rPr>
-          <w:rFonts w:ascii="Courier New" w:hAnsi="Courier New" w:cs="Courier New"/>
-        </w:rPr>
-      </w:pPr>
-      <m:oMathPara>
-        <m:oMath>
-          <m:r>
-            <w:rPr>
-              <w:rFonts w:ascii="Cambria Math" w:hAnsi="Cambria Math" w:cs="Courier New"/>
-            </w:rPr>
-            <m:t>d=0.08m</m:t>
-          </m:r>
-          <m:r>
-            <m:rPr>
-              <m:sty m:val="p"/>
-            </m:rPr>
-            <w:rPr>
-              <w:rFonts w:ascii="Courier New" w:hAnsi="Courier New" w:cs="Courier New"/>
-            </w:rPr>
-            <w:br/>
-          </m:r>
-        </m:oMath>
-        <m:oMath>
-          <m:r>
-            <m:rPr>
-              <m:sty m:val="p"/>
-            </m:rPr>
-            <w:rPr>
-              <w:rFonts w:ascii="Courier New" w:hAnsi="Courier New" w:cs="Courier New"/>
-            </w:rPr>
-            <w:br/>
-          </m:r>
-        </m:oMath>
-        <m:oMath>
-          <m:r>
-            <w:rPr>
-              <w:rFonts w:ascii="Cambria Math" w:hAnsi="Cambria Math" w:cs="Courier New"/>
-            </w:rPr>
-            <m:t>c=343 m/s</m:t>
-          </m:r>
-        </m:oMath>
-      </m:oMathPara>
-    </w:p>
-    <w:p>
-      <w:pPr>
-        <w:ind w:firstLine="720"/>
-      </w:pPr>
-      <w:r>
-        <w:t>T</w:t>
-      </w:r>
-      <w:r>
-        <w:t>a được:</w:t>
-      </w:r>
-    </w:p>
-    <w:p>
-      <w:pPr>
-        <w:jc w:val="center"/>
-      </w:pPr>
-      <m:oMath>
-        <m:sSub>
-          <m:sSubPr>
-            <m:ctrlPr>
-              <w:rPr>
-                <w:rFonts w:ascii="Cambria Math" w:hAnsi="Cambria Math"/>
-                <w:i/>
-              </w:rPr>
-            </m:ctrlPr>
-          </m:sSubPr>
-          <m:e>
-            <m:r>
-              <w:rPr>
-                <w:rFonts w:ascii="Cambria Math" w:hAnsi="Cambria Math"/>
-              </w:rPr>
-              <m:t>t</m:t>
-            </m:r>
-          </m:e>
-          <m:sub>
-            <m:r>
-              <w:rPr>
-                <w:rFonts w:ascii="Cambria Math" w:hAnsi="Cambria Math"/>
-              </w:rPr>
-              <m:t>max</m:t>
-            </m:r>
-          </m:sub>
-        </m:sSub>
-        <m:r>
-          <w:rPr>
-            <w:rFonts w:ascii="Cambria Math" w:hAnsi="Cambria Math"/>
-          </w:rPr>
-          <m:t>=</m:t>
-        </m:r>
-        <m:f>
-          <m:fPr>
-            <m:ctrlPr>
-              <w:rPr>
-                <w:rFonts w:ascii="Cambria Math" w:hAnsi="Cambria Math"/>
-                <w:i/>
-              </w:rPr>
-            </m:ctrlPr>
-          </m:fPr>
-          <m:num>
-            <m:r>
-              <w:rPr>
-                <w:rFonts w:ascii="Cambria Math" w:hAnsi="Cambria Math"/>
-              </w:rPr>
-              <m:t>0.08</m:t>
-            </m:r>
-          </m:num>
-          <m:den>
-            <m:r>
-              <w:rPr>
-                <w:rFonts w:ascii="Cambria Math" w:hAnsi="Cambria Math"/>
-              </w:rPr>
-              <m:t>343</m:t>
-            </m:r>
-          </m:den>
-        </m:f>
-      </m:oMath>
-      <w:r>
-        <w:t>=233</w:t>
-      </w:r>
-      <w:r>
-        <w:t>.</w:t>
-      </w:r>
-      <w:r>
-        <w:t>2</w:t>
-      </w:r>
-      <w:r>
-        <w:rPr>
-          <w:rStyle w:val="mord"/>
-        </w:rPr>
-        <w:t>μs</w:t>
-      </w:r>
-    </w:p>
-    <w:p>
-      <w:pPr>
-        <w:ind w:firstLine="720"/>
-      </w:pPr>
-    </w:p>
-    <w:p>
-      <w:pPr>
-        <w:ind w:firstLine="720"/>
-      </w:pPr>
-      <w:r>
-        <w:t>Như vậy độ lệch thời gian đến lớn nhất giữa hai microphone trong mảng là khoảng 233 μs.</w:t>
-      </w:r>
-    </w:p>
-    <w:bookmarkEnd w:id="8"/>
-    <w:p>
-      <w:pPr>
-        <w:pStyle w:val="Heading3"/>
-      </w:pPr>
-      <w:r>
-        <w:t>Độ trễ cực đại theo số mẫu</w:t>
-      </w:r>
-    </w:p>
-    <w:p>
-      <w:pPr>
-        <w:ind w:firstLine="720"/>
-      </w:pPr>
-      <w:r>
-        <w:t>Tín hiệu âm thanh trong đề tài được lấy mẫu với tần số:</w:t>
-      </w:r>
-    </w:p>
-    <w:p>
-      <w:pPr>
-        <w:spacing w:before="120" w:after="120"/>
-        <w:ind w:firstLine="720"/>
-        <w:jc w:val="center"/>
-      </w:pPr>
-      <w:r>
-        <w:t>fs=16000Hz</w:t>
-      </w:r>
-    </w:p>
-    <w:p>
-      <w:pPr>
-        <w:ind w:firstLine="720"/>
-      </w:pPr>
-      <w:r>
-        <w:t>Số mẫu tương ứng với độ trễ cực đại được xác định theo công thức:</w:t>
-      </w:r>
-    </w:p>
-    <w:p>
-      <w:pPr>
-        <w:spacing w:before="120" w:after="120"/>
-        <w:ind w:firstLine="720"/>
-        <w:jc w:val="center"/>
-      </w:pPr>
-      <m:oMathPara>
-        <m:oMath>
-          <m:sSub>
-            <m:sSubPr>
-              <m:ctrlPr>
-                <w:rPr>
-                  <w:rFonts w:ascii="Cambria Math" w:hAnsi="Cambria Math"/>
-                  <w:i/>
-                </w:rPr>
-              </m:ctrlPr>
-            </m:sSubPr>
-            <m:e>
-              <m:r>
-                <w:rPr>
-                  <w:rFonts w:ascii="Cambria Math" w:hAnsi="Cambria Math"/>
-                </w:rPr>
-                <m:t>N</m:t>
-              </m:r>
-            </m:e>
-            <m:sub>
-              <m:r>
-                <w:rPr>
-                  <w:rFonts w:ascii="Cambria Math" w:hAnsi="Cambria Math"/>
-                </w:rPr>
-                <m:t>delay</m:t>
-              </m:r>
-            </m:sub>
-          </m:sSub>
-          <m:r>
-            <w:rPr>
-              <w:rFonts w:ascii="Cambria Math" w:hAnsi="Cambria Math"/>
-            </w:rPr>
-            <m:t xml:space="preserve">= </m:t>
-          </m:r>
-          <m:sSub>
-            <m:sSubPr>
-              <m:ctrlPr>
-                <w:rPr>
-                  <w:rFonts w:ascii="Cambria Math" w:hAnsi="Cambria Math"/>
-                  <w:i/>
-                </w:rPr>
-              </m:ctrlPr>
-            </m:sSubPr>
-            <m:e>
-              <m:r>
-                <w:rPr>
-                  <w:rFonts w:ascii="Cambria Math" w:hAnsi="Cambria Math"/>
-                </w:rPr>
-                <m:t>t</m:t>
-              </m:r>
-            </m:e>
-            <m:sub>
-              <m:r>
-                <w:rPr>
-                  <w:rFonts w:ascii="Cambria Math" w:hAnsi="Cambria Math"/>
-                </w:rPr>
-                <m:t xml:space="preserve">max </m:t>
-              </m:r>
-            </m:sub>
-          </m:sSub>
-          <m:sSub>
-            <m:sSubPr>
-              <m:ctrlPr>
-                <w:rPr>
-                  <w:rFonts w:ascii="Cambria Math" w:hAnsi="Cambria Math"/>
-                  <w:i/>
-                </w:rPr>
-              </m:ctrlPr>
-            </m:sSubPr>
-            <m:e>
-              <m:r>
-                <w:rPr>
-                  <w:rFonts w:ascii="Cambria Math" w:hAnsi="Cambria Math"/>
-                </w:rPr>
-                <m:t xml:space="preserve"> × f</m:t>
-              </m:r>
-            </m:e>
-            <m:sub>
-              <m:r>
-                <w:rPr>
-                  <w:rFonts w:ascii="Cambria Math" w:hAnsi="Cambria Math"/>
-                </w:rPr>
-                <m:t>s</m:t>
-              </m:r>
-            </m:sub>
-          </m:sSub>
-          <m:r>
-            <m:rPr>
-              <m:sty m:val="p"/>
-            </m:rPr>
-            <w:rPr>
-              <w:rStyle w:val="mord"/>
-              <w:rFonts w:ascii="Cambria Math" w:hAnsi="Cambria Math"/>
-            </w:rPr>
-            <m:t>=233.2</m:t>
-          </m:r>
-          <m:r>
-            <m:rPr>
-              <m:sty m:val="p"/>
-            </m:rPr>
-            <w:rPr>
-              <w:rStyle w:val="mbin"/>
-              <w:rFonts w:ascii="Cambria Math" w:hAnsi="Cambria Math"/>
-            </w:rPr>
-            <m:t>×</m:t>
-          </m:r>
-          <m:sSup>
-            <m:sSupPr>
-              <m:ctrlPr>
-                <w:rPr>
-                  <w:rStyle w:val="mord"/>
-                  <w:rFonts w:ascii="Cambria Math" w:hAnsi="Cambria Math"/>
-                  <w:bCs/>
-                </w:rPr>
-              </m:ctrlPr>
-            </m:sSupPr>
-            <m:e>
-              <m:r>
-                <w:rPr>
-                  <w:rStyle w:val="mord"/>
-                  <w:rFonts w:ascii="Cambria Math" w:hAnsi="Cambria Math"/>
-                </w:rPr>
-                <m:t>10</m:t>
-              </m:r>
-            </m:e>
-            <m:sup>
-              <m:r>
-                <w:rPr>
-                  <w:rStyle w:val="mord"/>
-                  <w:rFonts w:ascii="Cambria Math" w:hAnsi="Cambria Math"/>
-                </w:rPr>
-                <m:t>-6</m:t>
-              </m:r>
-            </m:sup>
-          </m:sSup>
-          <m:r>
-            <m:rPr>
-              <m:sty m:val="p"/>
-            </m:rPr>
-            <w:rPr>
-              <w:rStyle w:val="mbin"/>
-              <w:rFonts w:ascii="Cambria Math" w:hAnsi="Cambria Math"/>
-            </w:rPr>
-            <m:t>×</m:t>
-          </m:r>
-          <m:r>
-            <m:rPr>
-              <m:sty m:val="p"/>
-            </m:rPr>
-            <w:rPr>
-              <w:rStyle w:val="mord"/>
-              <w:rFonts w:ascii="Cambria Math" w:hAnsi="Cambria Math"/>
-            </w:rPr>
-            <m:t>16000</m:t>
-          </m:r>
-          <m:r>
-            <m:rPr>
-              <m:sty m:val="p"/>
-            </m:rPr>
-            <w:rPr>
-              <w:rStyle w:val="mrel"/>
-              <w:rFonts w:ascii="Cambria Math" w:hAnsi="Cambria Math"/>
-            </w:rPr>
-            <m:t>=</m:t>
-          </m:r>
-          <m:r>
-            <m:rPr>
-              <m:sty m:val="p"/>
-            </m:rPr>
-            <w:rPr>
-              <w:rStyle w:val="mord"/>
-              <w:rFonts w:ascii="Cambria Math" w:hAnsi="Cambria Math"/>
-            </w:rPr>
-            <m:t>3.73≈4 samples</m:t>
-          </m:r>
-        </m:oMath>
-      </m:oMathPara>
-    </w:p>
-    <w:p>
-      <w:pPr>
-        <w:ind w:firstLine="720"/>
-      </w:pPr>
-      <w:r>
-        <w:lastRenderedPageBreak/>
-        <w:t>Giá trị độ trễ cực đại được sử dụng để xây dựng bảng mẫu độ trễ cho mảng microphone. Mỗi hướng khảo sát trong không gian sẽ tương ứng với một tổ hợp độ trễ nằm trong khoảng:</w:t>
-      </w:r>
-    </w:p>
-    <w:p>
-      <w:pPr>
-        <w:spacing w:before="120" w:after="120"/>
-        <w:jc w:val="center"/>
-      </w:pPr>
-      <w:r>
-        <w:t>[−4,+4]</w:t>
-      </w:r>
-      <w:r>
-        <w:t xml:space="preserve"> mẫu</w:t>
-      </w:r>
-    </w:p>
-    <w:p>
-      <w:pPr>
-        <w:ind w:firstLine="720"/>
-      </w:pPr>
-      <w:r>
-        <w:t>Các vector độ trễ này được lưu trữ dưới dạng bảng Delay Map và được sử dụng làm dữ liệu tham chiếu trong quá trình xác định hướng đến của nguồn âm. Sau khi thuật toán GCC-PHAT tính toán được các giá trị TDOA thực tế, hệ thống tiến hành so sánh với các vector trong bảng mẫu để tìm ra hướng có sai số nhỏ nhất.</w:t>
-      </w:r>
     </w:p>
     <w:p>
       <w:pPr>
@@ -4441,7 +4461,7 @@
                     <pic:cNvPicPr/>
                   </pic:nvPicPr>
                   <pic:blipFill>
-                    <a:blip r:embed="rId14"/>
+                    <a:blip r:embed="rId19"/>
                     <a:stretch>
                       <a:fillRect/>
                     </a:stretch>
@@ -4463,8 +4483,8 @@
       </w:r>
     </w:p>
     <w:sectPr>
-      <w:headerReference w:type="default" r:id="rId15"/>
-      <w:footerReference w:type="default" r:id="rId16"/>
+      <w:headerReference w:type="default" r:id="rId20"/>
+      <w:footerReference w:type="default" r:id="rId21"/>
       <w:pgSz w:w="11909" w:h="16834"/>
       <w:pgMar w:top="1985" w:right="1134" w:bottom="1701" w:left="1985" w:header="576" w:footer="578" w:gutter="0"/>
       <w:pgNumType w:start="1"/>
@@ -4501,6 +4521,16 @@
 </file>
 
 <file path=word/footer1.xml><?xml version="1.0" encoding="utf-8"?>
+<w:ftr xmlns:wpc="http://schemas.microsoft.com/office/word/2010/wordprocessingCanvas" xmlns:cx="http://schemas.microsoft.com/office/drawing/2014/chartex" xmlns:cx1="http://schemas.microsoft.com/office/drawing/2015/9/8/chartex" xmlns:cx2="http://schemas.microsoft.com/office/drawing/2015/10/21/chartex" xmlns:cx3="http://schemas.microsoft.com/office/drawing/2016/5/9/chartex" xmlns:cx4="http://schemas.microsoft.com/office/drawing/2016/5/10/chartex" xmlns:cx5="http://schemas.microsoft.com/office/drawing/2016/5/11/chartex" xmlns:cx6="http://schemas.microsoft.com/office/drawing/2016/5/12/chartex" xmlns:cx7="http://schemas.microsoft.com/office/drawing/2016/5/13/chartex" xmlns:cx8="http://schemas.microsoft.com/office/drawing/2016/5/14/chartex" xmlns:mc="http://schemas.openxmlformats.org/markup-compatibility/2006" xmlns:aink="http://schemas.microsoft.com/office/drawing/2016/ink" xmlns:am3d="http://schemas.microsoft.com/office/drawing/2017/model3d" xmlns:o="urn:schemas-microsoft-com:office:office" xmlns:oel="http://schemas.microsoft.com/office/2019/extlst" xmlns:r="http://schemas.openxmlformats.org/officeDocument/2006/relationships" xmlns:m="http://schemas.openxmlformats.org/officeDocument/2006/math" xmlns:v="urn:schemas-microsoft-com:vml" xmlns:wp14="http://schemas.microsoft.com/office/word/2010/wordprocessingDrawing" xmlns:wp="http://schemas.openxmlformats.org/drawingml/2006/wordprocessingDrawing" xmlns:w10="urn:schemas-microsoft-com:office:word" xmlns:w="http://schemas.openxmlformats.org/wordprocessingml/2006/main" xmlns:w14="http://schemas.microsoft.com/office/word/2010/wordml" xmlns:w15="http://schemas.microsoft.com/office/word/2012/wordml" xmlns:w16cex="http://schemas.microsoft.com/office/word/2018/wordml/cex" xmlns:w16cid="http://schemas.microsoft.com/office/word/2016/wordml/cid" xmlns:w16="http://schemas.microsoft.com/office/word/2018/wordml" xmlns:w16du="http://schemas.microsoft.com/office/word/2023/wordml/word16du" xmlns:w16sdtdh="http://schemas.microsoft.com/office/word/2020/wordml/sdtdatahash" xmlns:w16sdtfl="http://schemas.microsoft.com/office/word/2024/wordml/sdtformatlock" xmlns:w16se="http://schemas.microsoft.com/office/word/2015/wordml/symex" xmlns:wpg="http://schemas.microsoft.com/office/word/2010/wordprocessingGroup" xmlns:wpi="http://schemas.microsoft.com/office/word/2010/wordprocessingInk" xmlns:wne="http://schemas.microsoft.com/office/word/2006/wordml" xmlns:wps="http://schemas.microsoft.com/office/word/2010/wordprocessingShape" mc:Ignorable="w14 w15 w16se w16cid w16 w16cex w16sdtdh w16sdtfl w16du wp14">
+  <w:p>
+    <w:pPr>
+      <w:pStyle w:val="Footer"/>
+    </w:pPr>
+  </w:p>
+</w:ftr>
+</file>
+
+<file path=word/footer2.xml><?xml version="1.0" encoding="utf-8"?>
 <w:ftr xmlns:wpc="http://schemas.microsoft.com/office/word/2010/wordprocessingCanvas" xmlns:cx="http://schemas.microsoft.com/office/drawing/2014/chartex" xmlns:cx1="http://schemas.microsoft.com/office/drawing/2015/9/8/chartex" xmlns:cx2="http://schemas.microsoft.com/office/drawing/2015/10/21/chartex" xmlns:cx3="http://schemas.microsoft.com/office/drawing/2016/5/9/chartex" xmlns:cx4="http://schemas.microsoft.com/office/drawing/2016/5/10/chartex" xmlns:cx5="http://schemas.microsoft.com/office/drawing/2016/5/11/chartex" xmlns:cx6="http://schemas.microsoft.com/office/drawing/2016/5/12/chartex" xmlns:cx7="http://schemas.microsoft.com/office/drawing/2016/5/13/chartex" xmlns:cx8="http://schemas.microsoft.com/office/drawing/2016/5/14/chartex" xmlns:mc="http://schemas.openxmlformats.org/markup-compatibility/2006" xmlns:aink="http://schemas.microsoft.com/office/drawing/2016/ink" xmlns:am3d="http://schemas.microsoft.com/office/drawing/2017/model3d" xmlns:o="urn:schemas-microsoft-com:office:office" xmlns:oel="http://schemas.microsoft.com/office/2019/extlst" xmlns:r="http://schemas.openxmlformats.org/officeDocument/2006/relationships" xmlns:m="http://schemas.openxmlformats.org/officeDocument/2006/math" xmlns:v="urn:schemas-microsoft-com:vml" xmlns:wp14="http://schemas.microsoft.com/office/word/2010/wordprocessingDrawing" xmlns:wp="http://schemas.openxmlformats.org/drawingml/2006/wordprocessingDrawing" xmlns:w10="urn:schemas-microsoft-com:office:word" xmlns:w="http://schemas.openxmlformats.org/wordprocessingml/2006/main" xmlns:w14="http://schemas.microsoft.com/office/word/2010/wordml" xmlns:w15="http://schemas.microsoft.com/office/word/2012/wordml" xmlns:w16cex="http://schemas.microsoft.com/office/word/2018/wordml/cex" xmlns:w16cid="http://schemas.microsoft.com/office/word/2016/wordml/cid" xmlns:w16="http://schemas.microsoft.com/office/word/2018/wordml" xmlns:w16du="http://schemas.microsoft.com/office/word/2023/wordml/word16du" xmlns:w16sdtdh="http://schemas.microsoft.com/office/word/2020/wordml/sdtdatahash" xmlns:w16sdtfl="http://schemas.microsoft.com/office/word/2024/wordml/sdtformatlock" xmlns:w16se="http://schemas.microsoft.com/office/word/2015/wordml/symex" xmlns:wpg="http://schemas.microsoft.com/office/word/2010/wordprocessingGroup" xmlns:wpi="http://schemas.microsoft.com/office/word/2010/wordprocessingInk" xmlns:wne="http://schemas.microsoft.com/office/word/2006/wordml" xmlns:wps="http://schemas.microsoft.com/office/word/2010/wordprocessingShape" mc:Ignorable="w14 w15 w16se w16cid w16 w16cex w16sdtdh w16sdtfl w16du wp14">
   <w:p>
     <w:pPr>
@@ -4550,7 +4580,17 @@
 </w:ftr>
 </file>
 
-<file path=word/footer2.xml><?xml version="1.0" encoding="utf-8"?>
+<file path=word/footer3.xml><?xml version="1.0" encoding="utf-8"?>
+<w:ftr xmlns:wpc="http://schemas.microsoft.com/office/word/2010/wordprocessingCanvas" xmlns:cx="http://schemas.microsoft.com/office/drawing/2014/chartex" xmlns:cx1="http://schemas.microsoft.com/office/drawing/2015/9/8/chartex" xmlns:cx2="http://schemas.microsoft.com/office/drawing/2015/10/21/chartex" xmlns:cx3="http://schemas.microsoft.com/office/drawing/2016/5/9/chartex" xmlns:cx4="http://schemas.microsoft.com/office/drawing/2016/5/10/chartex" xmlns:cx5="http://schemas.microsoft.com/office/drawing/2016/5/11/chartex" xmlns:cx6="http://schemas.microsoft.com/office/drawing/2016/5/12/chartex" xmlns:cx7="http://schemas.microsoft.com/office/drawing/2016/5/13/chartex" xmlns:cx8="http://schemas.microsoft.com/office/drawing/2016/5/14/chartex" xmlns:mc="http://schemas.openxmlformats.org/markup-compatibility/2006" xmlns:aink="http://schemas.microsoft.com/office/drawing/2016/ink" xmlns:am3d="http://schemas.microsoft.com/office/drawing/2017/model3d" xmlns:o="urn:schemas-microsoft-com:office:office" xmlns:oel="http://schemas.microsoft.com/office/2019/extlst" xmlns:r="http://schemas.openxmlformats.org/officeDocument/2006/relationships" xmlns:m="http://schemas.openxmlformats.org/officeDocument/2006/math" xmlns:v="urn:schemas-microsoft-com:vml" xmlns:wp14="http://schemas.microsoft.com/office/word/2010/wordprocessingDrawing" xmlns:wp="http://schemas.openxmlformats.org/drawingml/2006/wordprocessingDrawing" xmlns:w10="urn:schemas-microsoft-com:office:word" xmlns:w="http://schemas.openxmlformats.org/wordprocessingml/2006/main" xmlns:w14="http://schemas.microsoft.com/office/word/2010/wordml" xmlns:w15="http://schemas.microsoft.com/office/word/2012/wordml" xmlns:w16cex="http://schemas.microsoft.com/office/word/2018/wordml/cex" xmlns:w16cid="http://schemas.microsoft.com/office/word/2016/wordml/cid" xmlns:w16="http://schemas.microsoft.com/office/word/2018/wordml" xmlns:w16du="http://schemas.microsoft.com/office/word/2023/wordml/word16du" xmlns:w16sdtdh="http://schemas.microsoft.com/office/word/2020/wordml/sdtdatahash" xmlns:w16sdtfl="http://schemas.microsoft.com/office/word/2024/wordml/sdtformatlock" xmlns:w16se="http://schemas.microsoft.com/office/word/2015/wordml/symex" xmlns:wpg="http://schemas.microsoft.com/office/word/2010/wordprocessingGroup" xmlns:wpi="http://schemas.microsoft.com/office/word/2010/wordprocessingInk" xmlns:wne="http://schemas.microsoft.com/office/word/2006/wordml" xmlns:wps="http://schemas.microsoft.com/office/word/2010/wordprocessingShape" mc:Ignorable="w14 w15 w16se w16cid w16 w16cex w16sdtdh w16sdtfl w16du wp14">
+  <w:p>
+    <w:pPr>
+      <w:pStyle w:val="Footer"/>
+    </w:pPr>
+  </w:p>
+</w:ftr>
+</file>
+
+<file path=word/footer4.xml><?xml version="1.0" encoding="utf-8"?>
 <w:ftr xmlns:wpc="http://schemas.microsoft.com/office/word/2010/wordprocessingCanvas" xmlns:cx="http://schemas.microsoft.com/office/drawing/2014/chartex" xmlns:cx1="http://schemas.microsoft.com/office/drawing/2015/9/8/chartex" xmlns:cx2="http://schemas.microsoft.com/office/drawing/2015/10/21/chartex" xmlns:cx3="http://schemas.microsoft.com/office/drawing/2016/5/9/chartex" xmlns:cx4="http://schemas.microsoft.com/office/drawing/2016/5/10/chartex" xmlns:cx5="http://schemas.microsoft.com/office/drawing/2016/5/11/chartex" xmlns:cx6="http://schemas.microsoft.com/office/drawing/2016/5/12/chartex" xmlns:cx7="http://schemas.microsoft.com/office/drawing/2016/5/13/chartex" xmlns:cx8="http://schemas.microsoft.com/office/drawing/2016/5/14/chartex" xmlns:mc="http://schemas.openxmlformats.org/markup-compatibility/2006" xmlns:aink="http://schemas.microsoft.com/office/drawing/2016/ink" xmlns:am3d="http://schemas.microsoft.com/office/drawing/2017/model3d" xmlns:o="urn:schemas-microsoft-com:office:office" xmlns:oel="http://schemas.microsoft.com/office/2019/extlst" xmlns:r="http://schemas.openxmlformats.org/officeDocument/2006/relationships" xmlns:m="http://schemas.openxmlformats.org/officeDocument/2006/math" xmlns:v="urn:schemas-microsoft-com:vml" xmlns:wp14="http://schemas.microsoft.com/office/word/2010/wordprocessingDrawing" xmlns:wp="http://schemas.openxmlformats.org/drawingml/2006/wordprocessingDrawing" xmlns:w10="urn:schemas-microsoft-com:office:word" xmlns:w="http://schemas.openxmlformats.org/wordprocessingml/2006/main" xmlns:w14="http://schemas.microsoft.com/office/word/2010/wordml" xmlns:w15="http://schemas.microsoft.com/office/word/2012/wordml" xmlns:w16cex="http://schemas.microsoft.com/office/word/2018/wordml/cex" xmlns:w16cid="http://schemas.microsoft.com/office/word/2016/wordml/cid" xmlns:w16="http://schemas.microsoft.com/office/word/2018/wordml" xmlns:w16du="http://schemas.microsoft.com/office/word/2023/wordml/word16du" xmlns:w16sdtdh="http://schemas.microsoft.com/office/word/2020/wordml/sdtdatahash" xmlns:w16sdtfl="http://schemas.microsoft.com/office/word/2024/wordml/sdtformatlock" xmlns:w16se="http://schemas.microsoft.com/office/word/2015/wordml/symex" xmlns:wpg="http://schemas.microsoft.com/office/word/2010/wordprocessingGroup" xmlns:wpi="http://schemas.microsoft.com/office/word/2010/wordprocessingInk" xmlns:wne="http://schemas.microsoft.com/office/word/2006/wordml" xmlns:wps="http://schemas.microsoft.com/office/word/2010/wordprocessingShape" mc:Ignorable="w14 w15 w16se w16cid w16 w16cex w16sdtdh w16sdtfl w16du wp14">
   <w:p>
     <w:pPr>
@@ -4583,7 +4623,7 @@
 </w:ftr>
 </file>
 
-<file path=word/footer3.xml><?xml version="1.0" encoding="utf-8"?>
+<file path=word/footer5.xml><?xml version="1.0" encoding="utf-8"?>
 <w:ftr xmlns:wpc="http://schemas.microsoft.com/office/word/2010/wordprocessingCanvas" xmlns:cx="http://schemas.microsoft.com/office/drawing/2014/chartex" xmlns:cx1="http://schemas.microsoft.com/office/drawing/2015/9/8/chartex" xmlns:cx2="http://schemas.microsoft.com/office/drawing/2015/10/21/chartex" xmlns:cx3="http://schemas.microsoft.com/office/drawing/2016/5/9/chartex" xmlns:cx4="http://schemas.microsoft.com/office/drawing/2016/5/10/chartex" xmlns:cx5="http://schemas.microsoft.com/office/drawing/2016/5/11/chartex" xmlns:cx6="http://schemas.microsoft.com/office/drawing/2016/5/12/chartex" xmlns:cx7="http://schemas.microsoft.com/office/drawing/2016/5/13/chartex" xmlns:cx8="http://schemas.microsoft.com/office/drawing/2016/5/14/chartex" xmlns:mc="http://schemas.openxmlformats.org/markup-compatibility/2006" xmlns:aink="http://schemas.microsoft.com/office/drawing/2016/ink" xmlns:am3d="http://schemas.microsoft.com/office/drawing/2017/model3d" xmlns:o="urn:schemas-microsoft-com:office:office" xmlns:oel="http://schemas.microsoft.com/office/2019/extlst" xmlns:r="http://schemas.openxmlformats.org/officeDocument/2006/relationships" xmlns:m="http://schemas.openxmlformats.org/officeDocument/2006/math" xmlns:v="urn:schemas-microsoft-com:vml" xmlns:wp14="http://schemas.microsoft.com/office/word/2010/wordprocessingDrawing" xmlns:wp="http://schemas.openxmlformats.org/drawingml/2006/wordprocessingDrawing" xmlns:w10="urn:schemas-microsoft-com:office:word" xmlns:w="http://schemas.openxmlformats.org/wordprocessingml/2006/main" xmlns:w14="http://schemas.microsoft.com/office/word/2010/wordml" xmlns:w15="http://schemas.microsoft.com/office/word/2012/wordml" xmlns:w16cex="http://schemas.microsoft.com/office/word/2018/wordml/cex" xmlns:w16cid="http://schemas.microsoft.com/office/word/2016/wordml/cid" xmlns:w16="http://schemas.microsoft.com/office/word/2018/wordml" xmlns:w16du="http://schemas.microsoft.com/office/word/2023/wordml/word16du" xmlns:w16sdtdh="http://schemas.microsoft.com/office/word/2020/wordml/sdtdatahash" xmlns:w16sdtfl="http://schemas.microsoft.com/office/word/2024/wordml/sdtformatlock" xmlns:w16se="http://schemas.microsoft.com/office/word/2015/wordml/symex" xmlns:wpg="http://schemas.microsoft.com/office/word/2010/wordprocessingGroup" xmlns:wpi="http://schemas.microsoft.com/office/word/2010/wordprocessingInk" xmlns:wne="http://schemas.microsoft.com/office/word/2006/wordml" xmlns:wps="http://schemas.microsoft.com/office/word/2010/wordprocessingShape" mc:Ignorable="w14 w15 w16se w16cid w16 w16cex w16sdtdh w16sdtfl w16du wp14">
   <w:p>
     <w:pPr>
@@ -4593,7 +4633,7 @@
 </w:ftr>
 </file>
 
-<file path=word/footer4.xml><?xml version="1.0" encoding="utf-8"?>
+<file path=word/footer6.xml><?xml version="1.0" encoding="utf-8"?>
 <w:ftr xmlns:wpc="http://schemas.microsoft.com/office/word/2010/wordprocessingCanvas" xmlns:cx="http://schemas.microsoft.com/office/drawing/2014/chartex" xmlns:cx1="http://schemas.microsoft.com/office/drawing/2015/9/8/chartex" xmlns:cx2="http://schemas.microsoft.com/office/drawing/2015/10/21/chartex" xmlns:cx3="http://schemas.microsoft.com/office/drawing/2016/5/9/chartex" xmlns:cx4="http://schemas.microsoft.com/office/drawing/2016/5/10/chartex" xmlns:cx5="http://schemas.microsoft.com/office/drawing/2016/5/11/chartex" xmlns:cx6="http://schemas.microsoft.com/office/drawing/2016/5/12/chartex" xmlns:cx7="http://schemas.microsoft.com/office/drawing/2016/5/13/chartex" xmlns:cx8="http://schemas.microsoft.com/office/drawing/2016/5/14/chartex" xmlns:mc="http://schemas.openxmlformats.org/markup-compatibility/2006" xmlns:aink="http://schemas.microsoft.com/office/drawing/2016/ink" xmlns:am3d="http://schemas.microsoft.com/office/drawing/2017/model3d" xmlns:o="urn:schemas-microsoft-com:office:office" xmlns:oel="http://schemas.microsoft.com/office/2019/extlst" xmlns:r="http://schemas.openxmlformats.org/officeDocument/2006/relationships" xmlns:m="http://schemas.openxmlformats.org/officeDocument/2006/math" xmlns:v="urn:schemas-microsoft-com:vml" xmlns:wp14="http://schemas.microsoft.com/office/word/2010/wordprocessingDrawing" xmlns:wp="http://schemas.openxmlformats.org/drawingml/2006/wordprocessingDrawing" xmlns:w10="urn:schemas-microsoft-com:office:word" xmlns:w="http://schemas.openxmlformats.org/wordprocessingml/2006/main" xmlns:w14="http://schemas.microsoft.com/office/word/2010/wordml" xmlns:w15="http://schemas.microsoft.com/office/word/2012/wordml" xmlns:w16cex="http://schemas.microsoft.com/office/word/2018/wordml/cex" xmlns:w16cid="http://schemas.microsoft.com/office/word/2016/wordml/cid" xmlns:w16="http://schemas.microsoft.com/office/word/2018/wordml" xmlns:w16du="http://schemas.microsoft.com/office/word/2023/wordml/word16du" xmlns:w16sdtdh="http://schemas.microsoft.com/office/word/2020/wordml/sdtdatahash" xmlns:w16sdtfl="http://schemas.microsoft.com/office/word/2024/wordml/sdtformatlock" xmlns:w16se="http://schemas.microsoft.com/office/word/2015/wordml/symex" xmlns:wpg="http://schemas.microsoft.com/office/word/2010/wordprocessingGroup" xmlns:wpi="http://schemas.microsoft.com/office/word/2010/wordprocessingInk" xmlns:wne="http://schemas.microsoft.com/office/word/2006/wordml" xmlns:wps="http://schemas.microsoft.com/office/word/2010/wordprocessingShape" mc:Ignorable="w14 w15 w16se w16cid w16 w16cex w16sdtdh w16sdtfl w16du wp14">
   <w:p>
     <w:pPr>
@@ -4690,6 +4730,36 @@
 </file>
 
 <file path=word/header1.xml><?xml version="1.0" encoding="utf-8"?>
+<w:hdr xmlns:wpc="http://schemas.microsoft.com/office/word/2010/wordprocessingCanvas" xmlns:cx="http://schemas.microsoft.com/office/drawing/2014/chartex" xmlns:cx1="http://schemas.microsoft.com/office/drawing/2015/9/8/chartex" xmlns:cx2="http://schemas.microsoft.com/office/drawing/2015/10/21/chartex" xmlns:cx3="http://schemas.microsoft.com/office/drawing/2016/5/9/chartex" xmlns:cx4="http://schemas.microsoft.com/office/drawing/2016/5/10/chartex" xmlns:cx5="http://schemas.microsoft.com/office/drawing/2016/5/11/chartex" xmlns:cx6="http://schemas.microsoft.com/office/drawing/2016/5/12/chartex" xmlns:cx7="http://schemas.microsoft.com/office/drawing/2016/5/13/chartex" xmlns:cx8="http://schemas.microsoft.com/office/drawing/2016/5/14/chartex" xmlns:mc="http://schemas.openxmlformats.org/markup-compatibility/2006" xmlns:aink="http://schemas.microsoft.com/office/drawing/2016/ink" xmlns:am3d="http://schemas.microsoft.com/office/drawing/2017/model3d" xmlns:o="urn:schemas-microsoft-com:office:office" xmlns:oel="http://schemas.microsoft.com/office/2019/extlst" xmlns:r="http://schemas.openxmlformats.org/officeDocument/2006/relationships" xmlns:m="http://schemas.openxmlformats.org/officeDocument/2006/math" xmlns:v="urn:schemas-microsoft-com:vml" xmlns:wp14="http://schemas.microsoft.com/office/word/2010/wordprocessingDrawing" xmlns:wp="http://schemas.openxmlformats.org/drawingml/2006/wordprocessingDrawing" xmlns:w10="urn:schemas-microsoft-com:office:word" xmlns:w="http://schemas.openxmlformats.org/wordprocessingml/2006/main" xmlns:w14="http://schemas.microsoft.com/office/word/2010/wordml" xmlns:w15="http://schemas.microsoft.com/office/word/2012/wordml" xmlns:w16cex="http://schemas.microsoft.com/office/word/2018/wordml/cex" xmlns:w16cid="http://schemas.microsoft.com/office/word/2016/wordml/cid" xmlns:w16="http://schemas.microsoft.com/office/word/2018/wordml" xmlns:w16du="http://schemas.microsoft.com/office/word/2023/wordml/word16du" xmlns:w16sdtdh="http://schemas.microsoft.com/office/word/2020/wordml/sdtdatahash" xmlns:w16sdtfl="http://schemas.microsoft.com/office/word/2024/wordml/sdtformatlock" xmlns:w16se="http://schemas.microsoft.com/office/word/2015/wordml/symex" xmlns:wpg="http://schemas.microsoft.com/office/word/2010/wordprocessingGroup" xmlns:wpi="http://schemas.microsoft.com/office/word/2010/wordprocessingInk" xmlns:wne="http://schemas.microsoft.com/office/word/2006/wordml" xmlns:wps="http://schemas.microsoft.com/office/word/2010/wordprocessingShape" mc:Ignorable="w14 w15 w16se w16cid w16 w16cex w16sdtdh w16sdtfl w16du wp14">
+  <w:p>
+    <w:pPr>
+      <w:pStyle w:val="Header"/>
+    </w:pPr>
+  </w:p>
+</w:hdr>
+</file>
+
+<file path=word/header2.xml><?xml version="1.0" encoding="utf-8"?>
+<w:hdr xmlns:wpc="http://schemas.microsoft.com/office/word/2010/wordprocessingCanvas" xmlns:cx="http://schemas.microsoft.com/office/drawing/2014/chartex" xmlns:cx1="http://schemas.microsoft.com/office/drawing/2015/9/8/chartex" xmlns:cx2="http://schemas.microsoft.com/office/drawing/2015/10/21/chartex" xmlns:cx3="http://schemas.microsoft.com/office/drawing/2016/5/9/chartex" xmlns:cx4="http://schemas.microsoft.com/office/drawing/2016/5/10/chartex" xmlns:cx5="http://schemas.microsoft.com/office/drawing/2016/5/11/chartex" xmlns:cx6="http://schemas.microsoft.com/office/drawing/2016/5/12/chartex" xmlns:cx7="http://schemas.microsoft.com/office/drawing/2016/5/13/chartex" xmlns:cx8="http://schemas.microsoft.com/office/drawing/2016/5/14/chartex" xmlns:mc="http://schemas.openxmlformats.org/markup-compatibility/2006" xmlns:aink="http://schemas.microsoft.com/office/drawing/2016/ink" xmlns:am3d="http://schemas.microsoft.com/office/drawing/2017/model3d" xmlns:o="urn:schemas-microsoft-com:office:office" xmlns:oel="http://schemas.microsoft.com/office/2019/extlst" xmlns:r="http://schemas.openxmlformats.org/officeDocument/2006/relationships" xmlns:m="http://schemas.openxmlformats.org/officeDocument/2006/math" xmlns:v="urn:schemas-microsoft-com:vml" xmlns:wp14="http://schemas.microsoft.com/office/word/2010/wordprocessingDrawing" xmlns:wp="http://schemas.openxmlformats.org/drawingml/2006/wordprocessingDrawing" xmlns:w10="urn:schemas-microsoft-com:office:word" xmlns:w="http://schemas.openxmlformats.org/wordprocessingml/2006/main" xmlns:w14="http://schemas.microsoft.com/office/word/2010/wordml" xmlns:w15="http://schemas.microsoft.com/office/word/2012/wordml" xmlns:w16cex="http://schemas.microsoft.com/office/word/2018/wordml/cex" xmlns:w16cid="http://schemas.microsoft.com/office/word/2016/wordml/cid" xmlns:w16="http://schemas.microsoft.com/office/word/2018/wordml" xmlns:w16du="http://schemas.microsoft.com/office/word/2023/wordml/word16du" xmlns:w16sdtdh="http://schemas.microsoft.com/office/word/2020/wordml/sdtdatahash" xmlns:w16sdtfl="http://schemas.microsoft.com/office/word/2024/wordml/sdtformatlock" xmlns:w16se="http://schemas.microsoft.com/office/word/2015/wordml/symex" xmlns:wpg="http://schemas.microsoft.com/office/word/2010/wordprocessingGroup" xmlns:wpi="http://schemas.microsoft.com/office/word/2010/wordprocessingInk" xmlns:wne="http://schemas.microsoft.com/office/word/2006/wordml" xmlns:wps="http://schemas.microsoft.com/office/word/2010/wordprocessingShape" mc:Ignorable="w14 w15 w16se w16cid w16 w16cex w16sdtdh w16sdtfl w16du wp14">
+  <w:p>
+    <w:pPr>
+      <w:pStyle w:val="Header"/>
+    </w:pPr>
+  </w:p>
+</w:hdr>
+</file>
+
+<file path=word/header3.xml><?xml version="1.0" encoding="utf-8"?>
+<w:hdr xmlns:wpc="http://schemas.microsoft.com/office/word/2010/wordprocessingCanvas" xmlns:cx="http://schemas.microsoft.com/office/drawing/2014/chartex" xmlns:cx1="http://schemas.microsoft.com/office/drawing/2015/9/8/chartex" xmlns:cx2="http://schemas.microsoft.com/office/drawing/2015/10/21/chartex" xmlns:cx3="http://schemas.microsoft.com/office/drawing/2016/5/9/chartex" xmlns:cx4="http://schemas.microsoft.com/office/drawing/2016/5/10/chartex" xmlns:cx5="http://schemas.microsoft.com/office/drawing/2016/5/11/chartex" xmlns:cx6="http://schemas.microsoft.com/office/drawing/2016/5/12/chartex" xmlns:cx7="http://schemas.microsoft.com/office/drawing/2016/5/13/chartex" xmlns:cx8="http://schemas.microsoft.com/office/drawing/2016/5/14/chartex" xmlns:mc="http://schemas.openxmlformats.org/markup-compatibility/2006" xmlns:aink="http://schemas.microsoft.com/office/drawing/2016/ink" xmlns:am3d="http://schemas.microsoft.com/office/drawing/2017/model3d" xmlns:o="urn:schemas-microsoft-com:office:office" xmlns:oel="http://schemas.microsoft.com/office/2019/extlst" xmlns:r="http://schemas.openxmlformats.org/officeDocument/2006/relationships" xmlns:m="http://schemas.openxmlformats.org/officeDocument/2006/math" xmlns:v="urn:schemas-microsoft-com:vml" xmlns:wp14="http://schemas.microsoft.com/office/word/2010/wordprocessingDrawing" xmlns:wp="http://schemas.openxmlformats.org/drawingml/2006/wordprocessingDrawing" xmlns:w10="urn:schemas-microsoft-com:office:word" xmlns:w="http://schemas.openxmlformats.org/wordprocessingml/2006/main" xmlns:w14="http://schemas.microsoft.com/office/word/2010/wordml" xmlns:w15="http://schemas.microsoft.com/office/word/2012/wordml" xmlns:w16cex="http://schemas.microsoft.com/office/word/2018/wordml/cex" xmlns:w16cid="http://schemas.microsoft.com/office/word/2016/wordml/cid" xmlns:w16="http://schemas.microsoft.com/office/word/2018/wordml" xmlns:w16du="http://schemas.microsoft.com/office/word/2023/wordml/word16du" xmlns:w16sdtdh="http://schemas.microsoft.com/office/word/2020/wordml/sdtdatahash" xmlns:w16sdtfl="http://schemas.microsoft.com/office/word/2024/wordml/sdtformatlock" xmlns:w16se="http://schemas.microsoft.com/office/word/2015/wordml/symex" xmlns:wpg="http://schemas.microsoft.com/office/word/2010/wordprocessingGroup" xmlns:wpi="http://schemas.microsoft.com/office/word/2010/wordprocessingInk" xmlns:wne="http://schemas.microsoft.com/office/word/2006/wordml" xmlns:wps="http://schemas.microsoft.com/office/word/2010/wordprocessingShape" mc:Ignorable="w14 w15 w16se w16cid w16 w16cex w16sdtdh w16sdtfl w16du wp14">
+  <w:p>
+    <w:pPr>
+      <w:pStyle w:val="Header"/>
+    </w:pPr>
+  </w:p>
+</w:hdr>
+</file>
+
+<file path=word/header4.xml><?xml version="1.0" encoding="utf-8"?>
 <w:hdr xmlns:wpc="http://schemas.microsoft.com/office/word/2010/wordprocessingCanvas" xmlns:cx="http://schemas.microsoft.com/office/drawing/2014/chartex" xmlns:cx1="http://schemas.microsoft.com/office/drawing/2015/9/8/chartex" xmlns:cx2="http://schemas.microsoft.com/office/drawing/2015/10/21/chartex" xmlns:cx3="http://schemas.microsoft.com/office/drawing/2016/5/9/chartex" xmlns:cx4="http://schemas.microsoft.com/office/drawing/2016/5/10/chartex" xmlns:cx5="http://schemas.microsoft.com/office/drawing/2016/5/11/chartex" xmlns:cx6="http://schemas.microsoft.com/office/drawing/2016/5/12/chartex" xmlns:cx7="http://schemas.microsoft.com/office/drawing/2016/5/13/chartex" xmlns:cx8="http://schemas.microsoft.com/office/drawing/2016/5/14/chartex" xmlns:mc="http://schemas.openxmlformats.org/markup-compatibility/2006" xmlns:aink="http://schemas.microsoft.com/office/drawing/2016/ink" xmlns:am3d="http://schemas.microsoft.com/office/drawing/2017/model3d" xmlns:o="urn:schemas-microsoft-com:office:office" xmlns:oel="http://schemas.microsoft.com/office/2019/extlst" xmlns:r="http://schemas.openxmlformats.org/officeDocument/2006/relationships" xmlns:m="http://schemas.openxmlformats.org/officeDocument/2006/math" xmlns:v="urn:schemas-microsoft-com:vml" xmlns:wp14="http://schemas.microsoft.com/office/word/2010/wordprocessingDrawing" xmlns:wp="http://schemas.openxmlformats.org/drawingml/2006/wordprocessingDrawing" xmlns:w10="urn:schemas-microsoft-com:office:word" xmlns:w="http://schemas.openxmlformats.org/wordprocessingml/2006/main" xmlns:w14="http://schemas.microsoft.com/office/word/2010/wordml" xmlns:w15="http://schemas.microsoft.com/office/word/2012/wordml" xmlns:w16cex="http://schemas.microsoft.com/office/word/2018/wordml/cex" xmlns:w16cid="http://schemas.microsoft.com/office/word/2016/wordml/cid" xmlns:w16="http://schemas.microsoft.com/office/word/2018/wordml" xmlns:w16du="http://schemas.microsoft.com/office/word/2023/wordml/word16du" xmlns:w16sdtdh="http://schemas.microsoft.com/office/word/2020/wordml/sdtdatahash" xmlns:w16sdtfl="http://schemas.microsoft.com/office/word/2024/wordml/sdtformatlock" xmlns:w16se="http://schemas.microsoft.com/office/word/2015/wordml/symex" xmlns:wpg="http://schemas.microsoft.com/office/word/2010/wordprocessingGroup" xmlns:wpi="http://schemas.microsoft.com/office/word/2010/wordprocessingInk" xmlns:wne="http://schemas.microsoft.com/office/word/2006/wordml" xmlns:wps="http://schemas.microsoft.com/office/word/2010/wordprocessingShape" mc:Ignorable="w14 w15 w16se w16cid w16 w16cex w16sdtdh w16sdtfl w16du wp14">
   <w:p>
     <w:pPr>
@@ -4716,7 +4786,7 @@
 </w:hdr>
 </file>
 
-<file path=word/header2.xml><?xml version="1.0" encoding="utf-8"?>
+<file path=word/header5.xml><?xml version="1.0" encoding="utf-8"?>
 <w:hdr xmlns:wpc="http://schemas.microsoft.com/office/word/2010/wordprocessingCanvas" xmlns:cx="http://schemas.microsoft.com/office/drawing/2014/chartex" xmlns:cx1="http://schemas.microsoft.com/office/drawing/2015/9/8/chartex" xmlns:cx2="http://schemas.microsoft.com/office/drawing/2015/10/21/chartex" xmlns:cx3="http://schemas.microsoft.com/office/drawing/2016/5/9/chartex" xmlns:cx4="http://schemas.microsoft.com/office/drawing/2016/5/10/chartex" xmlns:cx5="http://schemas.microsoft.com/office/drawing/2016/5/11/chartex" xmlns:cx6="http://schemas.microsoft.com/office/drawing/2016/5/12/chartex" xmlns:cx7="http://schemas.microsoft.com/office/drawing/2016/5/13/chartex" xmlns:cx8="http://schemas.microsoft.com/office/drawing/2016/5/14/chartex" xmlns:mc="http://schemas.openxmlformats.org/markup-compatibility/2006" xmlns:aink="http://schemas.microsoft.com/office/drawing/2016/ink" xmlns:am3d="http://schemas.microsoft.com/office/drawing/2017/model3d" xmlns:o="urn:schemas-microsoft-com:office:office" xmlns:oel="http://schemas.microsoft.com/office/2019/extlst" xmlns:r="http://schemas.openxmlformats.org/officeDocument/2006/relationships" xmlns:m="http://schemas.openxmlformats.org/officeDocument/2006/math" xmlns:v="urn:schemas-microsoft-com:vml" xmlns:wp14="http://schemas.microsoft.com/office/word/2010/wordprocessingDrawing" xmlns:wp="http://schemas.openxmlformats.org/drawingml/2006/wordprocessingDrawing" xmlns:w10="urn:schemas-microsoft-com:office:word" xmlns:w="http://schemas.openxmlformats.org/wordprocessingml/2006/main" xmlns:w14="http://schemas.microsoft.com/office/word/2010/wordml" xmlns:w15="http://schemas.microsoft.com/office/word/2012/wordml" xmlns:w16cex="http://schemas.microsoft.com/office/word/2018/wordml/cex" xmlns:w16cid="http://schemas.microsoft.com/office/word/2016/wordml/cid" xmlns:w16="http://schemas.microsoft.com/office/word/2018/wordml" xmlns:w16du="http://schemas.microsoft.com/office/word/2023/wordml/word16du" xmlns:w16sdtdh="http://schemas.microsoft.com/office/word/2020/wordml/sdtdatahash" xmlns:w16sdtfl="http://schemas.microsoft.com/office/word/2024/wordml/sdtformatlock" xmlns:w16se="http://schemas.microsoft.com/office/word/2015/wordml/symex" xmlns:wpg="http://schemas.microsoft.com/office/word/2010/wordprocessingGroup" xmlns:wpi="http://schemas.microsoft.com/office/word/2010/wordprocessingInk" xmlns:wne="http://schemas.microsoft.com/office/word/2006/wordml" xmlns:wps="http://schemas.microsoft.com/office/word/2010/wordprocessingShape" mc:Ignorable="w14 w15 w16se w16cid w16 w16cex w16sdtdh w16sdtfl w16du wp14">
   <w:p>
     <w:pPr>
@@ -12257,7 +12327,6 @@
   <w:style w:type="character" w:default="1" w:styleId="DefaultParagraphFont">
     <w:name w:val="Default Paragraph Font"/>
     <w:uiPriority w:val="1"/>
-    <w:semiHidden/>
     <w:unhideWhenUsed/>
   </w:style>
   <w:style w:type="table" w:default="1" w:styleId="TableNormal">
@@ -14074,7 +14143,7 @@
 
 <file path=word/webextensions/taskpanes.xml><?xml version="1.0" encoding="utf-8"?>
 <wetp:taskpanes xmlns:wetp="http://schemas.microsoft.com/office/webextensions/taskpanes/2010/11">
-  <wetp:taskpane dockstate="right" visibility="0" width="460" row="1">
+  <wetp:taskpane dockstate="right" visibility="0" width="610" row="1">
     <wetp:webextensionref xmlns:r="http://schemas.openxmlformats.org/officeDocument/2006/relationships" r:id="rId1"/>
   </wetp:taskpane>
 </wetp:taskpanes>

</xml_diff>